<commit_message>
Avoid Icelandic text OCR false positives
</commit_message>
<xml_diff>
--- a/docs/PDF测试问题与解决方案记录.docx
+++ b/docs/PDF测试问题与解决方案记录.docx
@@ -19,7 +19,7 @@
         <w:rPr>
           <w:rFonts w:ascii="Aptos" w:hAnsi="Aptos" w:eastAsia="Microsoft YaHei"/>
         </w:rPr>
-        <w:t>本文档记录 pdf-inspector 在 40 份本地 PDF 回归测试中发现的问题、原因、解决方案和验证结果。截至 2026 年 9 月 6 日，PDF-001、PDF-003、PDF-006 和 PDF-007 已完成修复；其余问题按建议顺序继续处理。</w:t>
+        <w:t>本文档记录 pdf-inspector 在 40 份本地 PDF 回归测试中发现的问题、原因、解决方案和验证结果。截至 2026 年 9 月 7 日，PDF-001、PDF-003、PDF-005、PDF-006 和 PDF-007 已完成修复；其余问题按建议顺序继续处理。</w:t>
       </w:r>
     </w:p>
     <w:p>
@@ -32,7 +32,7 @@
           <w:color w:val="5A5A5A"/>
           <w:sz w:val="18"/>
         </w:rPr>
-        <w:t>测试范围  两批非学术 PDF 共 40 份    最近更新  2026-09-06</w:t>
+        <w:t>测试范围  两批非学术 PDF 共 40 份    最近更新  2026-09-07</w:t>
       </w:r>
     </w:p>
     <w:p>
@@ -657,7 +657,7 @@
                 <w:rFonts w:ascii="Aptos" w:hAnsi="Aptos" w:eastAsia="Microsoft YaHei"/>
                 <w:sz w:val="18"/>
               </w:rPr>
-              <w:t>待修复</w:t>
+              <w:t>已关闭</w:t>
             </w:r>
           </w:p>
         </w:tc>
@@ -2561,6 +2561,17 @@
         <w:rPr>
           <w:rFonts w:ascii="Aptos" w:hAnsi="Aptos" w:eastAsia="Microsoft YaHei"/>
         </w:rPr>
+        <w:t>修复时间：2026-09-07 16:49:28（Asia/Shanghai）</w:t>
+      </w:r>
+    </w:p>
+    <w:p>
+      <w:pPr>
+        <w:pStyle w:val="ListBullet"/>
+      </w:pPr>
+      <w:r>
+        <w:rPr>
+          <w:rFonts w:ascii="Aptos" w:hAnsi="Aptos" w:eastAsia="Microsoft YaHei"/>
+        </w:rPr>
         <w:t>级别：高</w:t>
       </w:r>
     </w:p>
@@ -2572,7 +2583,7 @@
         <w:rPr>
           <w:rFonts w:ascii="Aptos" w:hAnsi="Aptos" w:eastAsia="Microsoft YaHei"/>
         </w:rPr>
-        <w:t>状态：待修复</w:t>
+        <w:t>状态：已关闭（实现完成并通过真实样本回归）</w:t>
       </w:r>
     </w:p>
     <w:p>
@@ -2583,7 +2594,7 @@
         <w:rPr>
           <w:rFonts w:ascii="Aptos" w:hAnsi="Aptos" w:eastAsia="Microsoft YaHei"/>
         </w:rPr>
-        <w:t>影响模块：src/detector.rs、garbage text 判定、语言字符统计</w:t>
+        <w:t>影响模块：src/text_quality.rs、src/lib.rs、CID 乱码判定</w:t>
       </w:r>
     </w:p>
     <w:p>
@@ -2598,6 +2609,7 @@
       </w:r>
     </w:p>
     <w:p>
+      <w:pPr/>
       <w:r>
         <w:rPr>
           <w:rFonts w:ascii="Aptos" w:hAnsi="Aptos" w:eastAsia="Microsoft YaHei"/>
@@ -2613,15 +2625,16 @@
         <w:rPr>
           <w:rFonts w:ascii="Aptos" w:hAnsi="Aptos" w:eastAsia="Microsoft YaHei"/>
         </w:rPr>
-        <w:t>原因判断</w:t>
-      </w:r>
-    </w:p>
-    <w:p>
-      <w:r>
-        <w:rPr>
-          <w:rFonts w:ascii="Aptos" w:hAnsi="Aptos" w:eastAsia="Microsoft YaHei"/>
-        </w:rPr>
-        <w:t>乱码评分可能过度依赖 ASCII 字母数字比例。带重音的拉丁字母、词典缩写、音标、词条符号和多栏短文本降低了当前评分。</w:t>
+        <w:t>已确认原因</w:t>
+      </w:r>
+    </w:p>
+    <w:p>
+      <w:pPr/>
+      <w:r>
+        <w:rPr>
+          <w:rFonts w:ascii="Aptos" w:hAnsi="Aptos" w:eastAsia="Microsoft YaHei"/>
+        </w:rPr>
+        <w:t>is_cid_garbage 会逐个检查文本片段。第 635 页的 þjá (þjá, þjáða, þjáðr), v. 和第 638 页的 þrá (þrá, þráða, þráðr), v. 都是正常冰岛语词形，但片段长度刚好超过原有下限，而且 þ、á、ð 等 Latin-1 字母占比较高、ASCII 字母较少，因此触发了高 Latin-1 比例即疑似 CID 乱码的条件。</w:t>
       </w:r>
     </w:p>
     <w:p>
@@ -2632,7 +2645,7 @@
         <w:rPr>
           <w:rFonts w:ascii="Aptos" w:hAnsi="Aptos" w:eastAsia="Microsoft YaHei"/>
         </w:rPr>
-        <w:t>解决方案</w:t>
+        <w:t>已实施修复</w:t>
       </w:r>
     </w:p>
     <w:p>
@@ -2643,7 +2656,7 @@
         <w:rPr>
           <w:rFonts w:ascii="Aptos" w:hAnsi="Aptos" w:eastAsia="Microsoft YaHei"/>
         </w:rPr>
-        <w:t>1. 统计 Unicode 字母类别，而不只统计 ASCII 字母。</w:t>
+        <w:t>1. 将 Latin-1 范围内的字母与符号分别统计；高比例的重音字母不再单独构成乱码证据。</w:t>
       </w:r>
     </w:p>
     <w:p>
@@ -2654,7 +2667,7 @@
         <w:rPr>
           <w:rFonts w:ascii="Aptos" w:hAnsi="Aptos" w:eastAsia="Microsoft YaHei"/>
         </w:rPr>
-        <w:t>2. 将带重音拉丁字符、组合附加符号和常见词典标点计入有效文本。</w:t>
+        <w:t>2. 高 Latin-1 比例分支现在还要求至少出现 3 个 Latin-1 非字母数字符号，才判定为字节级 CID mojibake。</w:t>
       </w:r>
     </w:p>
     <w:p>
@@ -2665,7 +2678,7 @@
         <w:rPr>
           <w:rFonts w:ascii="Aptos" w:hAnsi="Aptos" w:eastAsia="Microsoft YaHei"/>
         </w:rPr>
-        <w:t>3. 同时参考 ToUnicode 覆盖率、可打印字符比例和连续词形，而不是单一阈值。</w:t>
+        <w:t>3. 保留原有 C1 控制字符、私用区、替换字符、非字母数字符号汤和移位乱码检测。</w:t>
       </w:r>
     </w:p>
     <w:p>
@@ -2676,18 +2689,7 @@
         <w:rPr>
           <w:rFonts w:ascii="Aptos" w:hAnsi="Aptos" w:eastAsia="Microsoft YaHei"/>
         </w:rPr>
-        <w:t>4. 对接近阈值的页面比较原始字形数量与成功映射数量。</w:t>
-      </w:r>
-    </w:p>
-    <w:p>
-      <w:pPr>
-        <w:ind w:left="397" w:hanging="255"/>
-      </w:pPr>
-      <w:r>
-        <w:rPr>
-          <w:rFonts w:ascii="Aptos" w:hAnsi="Aptos" w:eastAsia="Microsoft YaHei"/>
-        </w:rPr>
-        <w:t>5. 将这两页加入固定回归测试。</w:t>
+        <w:t>4. 增加第 635、638 页真实词条对应的单元回归，并补充无 C1 控制字符的符号型 Latin-1 乱码保护测试。</w:t>
       </w:r>
     </w:p>
     <w:p>
@@ -2698,15 +2700,117 @@
         <w:rPr>
           <w:rFonts w:ascii="Aptos" w:hAnsi="Aptos" w:eastAsia="Microsoft YaHei"/>
         </w:rPr>
-        <w:t>验收标准</w:t>
-      </w:r>
-    </w:p>
-    <w:p>
-      <w:r>
-        <w:rPr>
-          <w:rFonts w:ascii="Aptos" w:hAnsi="Aptos" w:eastAsia="Microsoft YaHei"/>
-        </w:rPr>
-        <w:t>第 635、638 页不再被标记为 OCR，同时真正的扫描页仍然能够正确识别。</w:t>
+        <w:t>修复结果</w:t>
+      </w:r>
+    </w:p>
+    <w:p>
+      <w:pPr>
+        <w:pStyle w:val="ListBullet"/>
+      </w:pPr>
+      <w:r>
+        <w:rPr>
+          <w:rFonts w:ascii="Aptos" w:hAnsi="Aptos" w:eastAsia="Microsoft YaHei"/>
+        </w:rPr>
+        <w:t>07-multicolumn-dictionary.pdf：pages_needing_ocr 从 635,638 变为空列表。</w:t>
+      </w:r>
+    </w:p>
+    <w:p>
+      <w:pPr>
+        <w:pStyle w:val="ListBullet"/>
+      </w:pPr>
+      <w:r>
+        <w:rPr>
+          <w:rFonts w:ascii="Aptos" w:hAnsi="Aptos" w:eastAsia="Microsoft YaHei"/>
+        </w:rPr>
+        <w:t>选择转换第 635、638 页成功，两页均生成页面标记，并保留 þjá、þrá 及其词形正文。</w:t>
+      </w:r>
+    </w:p>
+    <w:p>
+      <w:pPr>
+        <w:pStyle w:val="ListBullet"/>
+      </w:pPr>
+      <w:r>
+        <w:rPr>
+          <w:rFonts w:ascii="Aptos" w:hAnsi="Aptos" w:eastAsia="Microsoft YaHei"/>
+        </w:rPr>
+        <w:t>真扫描样本 16-pdf20-utf8-annotation.pdf 仍识别为 scanned，第 1 页仍要求 OCR，原因是 no_text。</w:t>
+      </w:r>
+    </w:p>
+    <w:p>
+      <w:pPr>
+        <w:pStyle w:val="ListBullet"/>
+      </w:pPr>
+      <w:r>
+        <w:rPr>
+          <w:rFonts w:ascii="Aptos" w:hAnsi="Aptos" w:eastAsia="Microsoft YaHei"/>
+        </w:rPr>
+        <w:t>移位乱码单元与集成回归全部通过，真实乱码仍要求 OCR。</w:t>
+      </w:r>
+    </w:p>
+    <w:p>
+      <w:pPr>
+        <w:pStyle w:val="ListBullet"/>
+      </w:pPr>
+      <w:r>
+        <w:rPr>
+          <w:rFonts w:ascii="Aptos" w:hAnsi="Aptos" w:eastAsia="Microsoft YaHei"/>
+        </w:rPr>
+        <w:t>40 份本地 PDF 全量回归：40 份检测成功，37 份直接转换，3 份按预期转入 OCR，0 份被拒绝；Markdown 总字符数 4,328,894，U+FFFD 共 381 个，表格行数保持 647 行。</w:t>
+      </w:r>
+    </w:p>
+    <w:p>
+      <w:pPr>
+        <w:pStyle w:val="Heading2"/>
+      </w:pPr>
+      <w:r>
+        <w:rPr>
+          <w:rFonts w:ascii="Aptos" w:hAnsi="Aptos" w:eastAsia="Microsoft YaHei"/>
+        </w:rPr>
+        <w:t>验证记录</w:t>
+      </w:r>
+    </w:p>
+    <w:p>
+      <w:pPr>
+        <w:pStyle w:val="ListBullet"/>
+      </w:pPr>
+      <w:r>
+        <w:rPr>
+          <w:rFonts w:ascii="Aptos" w:hAnsi="Aptos" w:eastAsia="Microsoft YaHei"/>
+        </w:rPr>
+        <w:t>cargo fmt --all -- --check：通过。</w:t>
+      </w:r>
+    </w:p>
+    <w:p>
+      <w:pPr>
+        <w:pStyle w:val="ListBullet"/>
+      </w:pPr>
+      <w:r>
+        <w:rPr>
+          <w:rFonts w:ascii="Aptos" w:hAnsi="Aptos" w:eastAsia="Microsoft YaHei"/>
+        </w:rPr>
+        <w:t>cargo clippy --offline -- -D warnings：通过，0 个 Clippy 警告。</w:t>
+      </w:r>
+    </w:p>
+    <w:p>
+      <w:pPr>
+        <w:pStyle w:val="ListBullet"/>
+      </w:pPr>
+      <w:r>
+        <w:rPr>
+          <w:rFonts w:ascii="Aptos" w:hAnsi="Aptos" w:eastAsia="Microsoft YaHei"/>
+        </w:rPr>
+        <w:t>cargo test --offline：通过，共 876 项（728 项库单元测试、1 项命令测试、145 项集成测试、2 项文档测试），0 项失败。</w:t>
+      </w:r>
+    </w:p>
+    <w:p>
+      <w:pPr>
+        <w:pStyle w:val="ListBullet"/>
+      </w:pPr>
+      <w:r>
+        <w:rPr>
+          <w:rFonts w:ascii="Aptos" w:hAnsi="Aptos" w:eastAsia="Microsoft YaHei"/>
+        </w:rPr>
+        <w:t>cargo build --release --offline：通过。</w:t>
       </w:r>
     </w:p>
     <w:p>

</xml_diff>

<commit_message>
Complete remaining PDF regression fixes
</commit_message>
<xml_diff>
--- a/docs/PDF测试问题与解决方案记录.docx
+++ b/docs/PDF测试问题与解决方案记录.docx
@@ -19,7 +19,7 @@
         <w:rPr>
           <w:rFonts w:ascii="Aptos" w:hAnsi="Aptos" w:eastAsia="Microsoft YaHei"/>
         </w:rPr>
-        <w:t>本文档记录 pdf-inspector 在 40 份本地 PDF 回归测试中发现的问题、原因、解决方案和验证结果。截至 2026 年 9 月 7 日，PDF-001、PDF-003、PDF-005、PDF-006 和 PDF-007 已完成修复；其余问题按建议顺序继续处理。</w:t>
+        <w:t>本文档记录 pdf-inspector 在 40 份本地 PDF 回归测试中发现的问题、原因、解决方案和验证结果。截至 2026 年 9 月 7 日，PDF-001 至 PDF-009 均已完成修复或回归关闭。</w:t>
       </w:r>
     </w:p>
     <w:p>
@@ -346,7 +346,7 @@
                 <w:rFonts w:ascii="Aptos" w:hAnsi="Aptos" w:eastAsia="Microsoft YaHei"/>
                 <w:sz w:val="18"/>
               </w:rPr>
-              <w:t>待确认并修复</w:t>
+              <w:t>已关闭</w:t>
             </w:r>
           </w:p>
         </w:tc>
@@ -545,16 +545,12 @@
             <w:shd w:fill="EAF2F8"/>
           </w:tcPr>
           <w:p>
-            <w:pPr>
-              <w:spacing w:after="0" w:line="240" w:lineRule="auto"/>
-              <w:jc w:val="center"/>
-            </w:pPr>
             <w:r>
               <w:rPr>
                 <w:rFonts w:ascii="Aptos" w:hAnsi="Aptos" w:eastAsia="Microsoft YaHei"/>
                 <w:sz w:val="18"/>
               </w:rPr>
-              <w:t>待修复</w:t>
+              <w:t>已关闭</w:t>
             </w:r>
           </w:p>
         </w:tc>
@@ -961,16 +957,12 @@
             <w:shd w:fill="EAF2F8"/>
           </w:tcPr>
           <w:p>
-            <w:pPr>
-              <w:spacing w:after="0" w:line="240" w:lineRule="auto"/>
-              <w:jc w:val="center"/>
-            </w:pPr>
             <w:r>
               <w:rPr>
                 <w:rFonts w:ascii="Aptos" w:hAnsi="Aptos" w:eastAsia="Microsoft YaHei"/>
                 <w:sz w:val="18"/>
               </w:rPr>
-              <w:t>待修复</w:t>
+              <w:t>已关闭</w:t>
             </w:r>
           </w:p>
         </w:tc>
@@ -1064,16 +1056,12 @@
             </w:tcMar>
           </w:tcPr>
           <w:p>
-            <w:pPr>
-              <w:spacing w:after="0" w:line="240" w:lineRule="auto"/>
-              <w:jc w:val="center"/>
-            </w:pPr>
             <w:r>
               <w:rPr>
                 <w:rFonts w:ascii="Aptos" w:hAnsi="Aptos" w:eastAsia="Microsoft YaHei"/>
                 <w:sz w:val="18"/>
               </w:rPr>
-              <w:t>待补充测试</w:t>
+              <w:t>已关闭</w:t>
             </w:r>
           </w:p>
         </w:tc>
@@ -1702,6 +1690,17 @@
         <w:rPr>
           <w:rFonts w:ascii="Aptos" w:hAnsi="Aptos" w:eastAsia="Microsoft YaHei"/>
         </w:rPr>
+        <w:t>修复时间：2026-09-07 17:27:00（Asia/Shanghai）</w:t>
+      </w:r>
+    </w:p>
+    <w:p>
+      <w:pPr>
+        <w:pStyle w:val="ListBullet"/>
+      </w:pPr>
+      <w:r>
+        <w:rPr>
+          <w:rFonts w:ascii="Aptos" w:hAnsi="Aptos" w:eastAsia="Microsoft YaHei"/>
+        </w:rPr>
         <w:t>级别：中</w:t>
       </w:r>
     </w:p>
@@ -1713,7 +1712,7 @@
         <w:rPr>
           <w:rFonts w:ascii="Aptos" w:hAnsi="Aptos" w:eastAsia="Microsoft YaHei"/>
         </w:rPr>
-        <w:t>状态：待确认并修复</w:t>
+        <w:t>状态：已关闭（实现完成并通过真实样本回归）</w:t>
       </w:r>
     </w:p>
     <w:p>
@@ -1724,7 +1723,7 @@
         <w:rPr>
           <w:rFonts w:ascii="Aptos" w:hAnsi="Aptos" w:eastAsia="Microsoft YaHei"/>
         </w:rPr>
-        <w:t>影响模块：src/markdown/convert.rs、页面结果组装逻辑</w:t>
+        <w:t>影响模块：src/lib.rs、src/markdown/mod.rs、src/markdown/convert.rs、页面结果组装逻辑</w:t>
       </w:r>
     </w:p>
     <w:p>
@@ -1739,6 +1738,7 @@
       </w:r>
     </w:p>
     <w:p>
+      <w:pPr/>
       <w:r>
         <w:rPr>
           <w:rFonts w:ascii="Aptos" w:hAnsi="Aptos" w:eastAsia="Microsoft YaHei"/>
@@ -1798,6 +1798,361 @@
         <w:rPr>
           <w:rFonts w:ascii="Aptos" w:hAnsi="Aptos" w:eastAsia="Microsoft YaHei"/>
         </w:rPr>
+        <w:t>已确认原因</w:t>
+      </w:r>
+    </w:p>
+    <w:p>
+      <w:pPr/>
+      <w:r>
+        <w:rPr>
+          <w:rFonts w:ascii="Aptos" w:hAnsi="Aptos" w:eastAsia="Microsoft YaHei"/>
+        </w:rPr>
+        <w:t>Markdown 转换器只能看到包含文本、表格或已输出图片的页面，没有接收到源 PDF 的物理页数。它会为已有内容切换页面并生成标记，但无法知道两个内容页之间或文档首尾还存在空白页、纯图片页或无可提取文本页。</w:t>
+      </w:r>
+    </w:p>
+    <w:p>
+      <w:pPr>
+        <w:pStyle w:val="Heading2"/>
+      </w:pPr>
+      <w:r>
+        <w:rPr>
+          <w:rFonts w:ascii="Aptos" w:hAnsi="Aptos" w:eastAsia="Microsoft YaHei"/>
+        </w:rPr>
+        <w:t>已实施修复</w:t>
+      </w:r>
+    </w:p>
+    <w:p>
+      <w:pPr>
+        <w:ind w:left="397" w:hanging="255"/>
+      </w:pPr>
+      <w:r>
+        <w:rPr>
+          <w:rFonts w:ascii="Aptos" w:hAnsi="Aptos" w:eastAsia="Microsoft YaHei"/>
+        </w:rPr>
+        <w:t>1. 主处理链路将加载 PDF 时得到的 page_count 传入 Markdown 页面输出上下文。</w:t>
+      </w:r>
+    </w:p>
+    <w:p>
+      <w:pPr>
+        <w:ind w:left="397" w:hanging="255"/>
+      </w:pPr>
+      <w:r>
+        <w:rPr>
+          <w:rFonts w:ascii="Aptos" w:hAnsi="Aptos" w:eastAsia="Microsoft YaHei"/>
+        </w:rPr>
+        <w:t>2. 启用 --pages 时，转换器按物理页码补写内容页之间、首部和尾部缺失的 &lt;!-- Page N --&gt;。</w:t>
+      </w:r>
+    </w:p>
+    <w:p>
+      <w:pPr>
+        <w:ind w:left="397" w:hanging="255"/>
+      </w:pPr>
+      <w:r>
+        <w:rPr>
+          <w:rFonts w:ascii="Aptos" w:hAnsi="Aptos" w:eastAsia="Microsoft YaHei"/>
+        </w:rPr>
+        <w:t>3. 表格页和图片页继续通过原有刷新流程输出内容，补齐标记不会复制或移动其内容。</w:t>
+      </w:r>
+    </w:p>
+    <w:p>
+      <w:pPr>
+        <w:ind w:left="397" w:hanging="255"/>
+      </w:pPr>
+      <w:r>
+        <w:rPr>
+          <w:rFonts w:ascii="Aptos" w:hAnsi="Aptos" w:eastAsia="Microsoft YaHei"/>
+        </w:rPr>
+        <w:t>4. 未启用 --pages 时保持原有 Markdown 输出；独立的公共 Markdown 组装 API 也不推测未知物理页数。</w:t>
+      </w:r>
+    </w:p>
+    <w:p>
+      <w:pPr>
+        <w:ind w:left="397" w:hanging="255"/>
+      </w:pPr>
+      <w:r>
+        <w:rPr>
+          <w:rFonts w:ascii="Aptos" w:hAnsi="Aptos" w:eastAsia="Microsoft YaHei"/>
+        </w:rPr>
+        <w:t>5. 使用内部上下文结构传递页阈值、页面分割集合和物理页数，避免扩大公开配置结构或产生参数膨胀。</w:t>
+      </w:r>
+    </w:p>
+    <w:p>
+      <w:pPr>
+        <w:ind w:left="397" w:hanging="255"/>
+      </w:pPr>
+      <w:r>
+        <w:rPr>
+          <w:rFonts w:ascii="Aptos" w:hAnsi="Aptos" w:eastAsia="Microsoft YaHei"/>
+        </w:rPr>
+        <w:t>6. 增加中间空页、首尾空页和全部无文本项的单元测试。</w:t>
+      </w:r>
+    </w:p>
+    <w:p>
+      <w:pPr>
+        <w:pStyle w:val="Heading2"/>
+      </w:pPr>
+      <w:r>
+        <w:rPr>
+          <w:rFonts w:ascii="Aptos" w:hAnsi="Aptos" w:eastAsia="Microsoft YaHei"/>
+        </w:rPr>
+        <w:t>修复结果</w:t>
+      </w:r>
+    </w:p>
+    <w:p>
+      <w:pPr>
+        <w:ind w:left="397" w:hanging="255"/>
+      </w:pPr>
+      <w:r>
+        <w:rPr>
+          <w:rFonts w:ascii="Aptos" w:hAnsi="Aptos" w:eastAsia="Microsoft YaHei"/>
+        </w:rPr>
+        <w:t>1. 18-large-print-novel.pdf：页面标记由 279 个增至 282 个，序列严格为 1 至 282，补齐第 1、4、6 页。</w:t>
+      </w:r>
+    </w:p>
+    <w:p>
+      <w:pPr>
+        <w:ind w:left="397" w:hanging="255"/>
+      </w:pPr>
+      <w:r>
+        <w:rPr>
+          <w:rFonts w:ascii="Aptos" w:hAnsi="Aptos" w:eastAsia="Microsoft YaHei"/>
+        </w:rPr>
+        <w:t>2. 04-css-layout-sample.pdf：页面标记由 11 个增至 13 个，序列严格为 1 至 13，补齐第 2、4 页。</w:t>
+      </w:r>
+    </w:p>
+    <w:p>
+      <w:pPr>
+        <w:ind w:left="397" w:hanging="255"/>
+      </w:pPr>
+      <w:r>
+        <w:rPr>
+          <w:rFonts w:ascii="Aptos" w:hAnsi="Aptos" w:eastAsia="Microsoft YaHei"/>
+        </w:rPr>
+        <w:t>3. 05-poetry-booklet.pdf：页面标记由 206 个增至 208 个，序列严格为 1 至 208，补齐第 2、185 页。</w:t>
+      </w:r>
+    </w:p>
+    <w:p>
+      <w:pPr>
+        <w:ind w:left="397" w:hanging="255"/>
+      </w:pPr>
+      <w:r>
+        <w:rPr>
+          <w:rFonts w:ascii="Aptos" w:hAnsi="Aptos" w:eastAsia="Microsoft YaHei"/>
+        </w:rPr>
+        <w:t>4. 40 份本地 PDF 全量回归中，37 份直接转换文件的标记数全部等于物理页数，0 份存在缺号或重复；3 份整文件 OCR 样本仍按预期进入 OCR，0 份被拒绝。</w:t>
+      </w:r>
+    </w:p>
+    <w:p>
+      <w:pPr>
+        <w:ind w:left="397" w:hanging="255"/>
+      </w:pPr>
+      <w:r>
+        <w:rPr>
+          <w:rFonts w:ascii="Aptos" w:hAnsi="Aptos" w:eastAsia="Microsoft YaHei"/>
+        </w:rPr>
+        <w:t>5. Markdown 总字符数由 4,328,894 增至 4,329,015，增加的 121 个字符均来自补齐的 7 个页面标记；U+FFFD 保持 381 个，表格行数保持 647 行。</w:t>
+      </w:r>
+    </w:p>
+    <w:p>
+      <w:pPr>
+        <w:pStyle w:val="Heading2"/>
+      </w:pPr>
+      <w:r>
+        <w:rPr>
+          <w:rFonts w:ascii="Aptos" w:hAnsi="Aptos" w:eastAsia="Microsoft YaHei"/>
+        </w:rPr>
+        <w:t>验证记录</w:t>
+      </w:r>
+    </w:p>
+    <w:p>
+      <w:pPr>
+        <w:pStyle w:val="ListBullet"/>
+      </w:pPr>
+      <w:r>
+        <w:rPr>
+          <w:rFonts w:ascii="Aptos" w:hAnsi="Aptos" w:eastAsia="Microsoft YaHei"/>
+        </w:rPr>
+        <w:t>cargo fmt --all -- --check：通过。</w:t>
+      </w:r>
+    </w:p>
+    <w:p>
+      <w:pPr>
+        <w:pStyle w:val="ListBullet"/>
+      </w:pPr>
+      <w:r>
+        <w:rPr>
+          <w:rFonts w:ascii="Aptos" w:hAnsi="Aptos" w:eastAsia="Microsoft YaHei"/>
+        </w:rPr>
+        <w:t>cargo clippy --offline -- -D warnings：通过，0 个 Clippy 警告。</w:t>
+      </w:r>
+    </w:p>
+    <w:p>
+      <w:pPr>
+        <w:pStyle w:val="ListBullet"/>
+      </w:pPr>
+      <w:r>
+        <w:t>cargo test --offline：通过，共 879 项（731 项库单元测试、1 项命令测试、145 项集成测试、2 项文档测试），0 项失败。</w:t>
+      </w:r>
+    </w:p>
+    <w:p>
+      <w:pPr>
+        <w:pStyle w:val="ListBullet"/>
+      </w:pPr>
+      <w:r>
+        <w:rPr>
+          <w:rFonts w:ascii="Aptos" w:hAnsi="Aptos" w:eastAsia="Microsoft YaHei"/>
+        </w:rPr>
+        <w:t>cargo build --release --offline：通过。</w:t>
+      </w:r>
+    </w:p>
+    <w:p>
+      <w:pPr>
+        <w:pStyle w:val="Heading1"/>
+      </w:pPr>
+      <w:r>
+        <w:rPr>
+          <w:rFonts w:ascii="Aptos" w:hAnsi="Aptos" w:eastAsia="Microsoft YaHei"/>
+        </w:rPr>
+        <w:t>3. PDF-003：多栏正文被误判为 Markdown 表格</w:t>
+      </w:r>
+    </w:p>
+    <w:p>
+      <w:pPr>
+        <w:pStyle w:val="ListBullet"/>
+      </w:pPr>
+      <w:r>
+        <w:rPr>
+          <w:rFonts w:ascii="Aptos" w:hAnsi="Aptos" w:eastAsia="Microsoft YaHei"/>
+        </w:rPr>
+        <w:t>发现时间：2026-09-06</w:t>
+      </w:r>
+    </w:p>
+    <w:p>
+      <w:pPr>
+        <w:pStyle w:val="ListBullet"/>
+      </w:pPr>
+      <w:r>
+        <w:rPr>
+          <w:rFonts w:ascii="Aptos" w:hAnsi="Aptos" w:eastAsia="Microsoft YaHei"/>
+        </w:rPr>
+        <w:t>修复时间：2026-09-06 23:08:00（Asia/Shanghai）</w:t>
+      </w:r>
+    </w:p>
+    <w:p>
+      <w:pPr>
+        <w:pStyle w:val="ListBullet"/>
+      </w:pPr>
+      <w:r>
+        <w:rPr>
+          <w:rFonts w:ascii="Aptos" w:hAnsi="Aptos" w:eastAsia="Microsoft YaHei"/>
+        </w:rPr>
+        <w:t>级别：高</w:t>
+      </w:r>
+    </w:p>
+    <w:p>
+      <w:pPr>
+        <w:pStyle w:val="ListBullet"/>
+      </w:pPr>
+      <w:r>
+        <w:rPr>
+          <w:rFonts w:ascii="Aptos" w:hAnsi="Aptos" w:eastAsia="Microsoft YaHei"/>
+        </w:rPr>
+        <w:t>状态：已关闭（实现完成并通过真实样本回归）</w:t>
+      </w:r>
+    </w:p>
+    <w:p>
+      <w:pPr>
+        <w:pStyle w:val="ListBullet"/>
+      </w:pPr>
+      <w:r>
+        <w:rPr>
+          <w:rFonts w:ascii="Aptos" w:hAnsi="Aptos" w:eastAsia="Microsoft YaHei"/>
+        </w:rPr>
+        <w:t>影响模块：src/tables/detect_heuristic.rs、src/tables/detect_lines.rs、src/markdown/mod.rs</w:t>
+      </w:r>
+    </w:p>
+    <w:p>
+      <w:pPr>
+        <w:pStyle w:val="Heading2"/>
+      </w:pPr>
+      <w:r>
+        <w:rPr>
+          <w:rFonts w:ascii="Aptos" w:hAnsi="Aptos" w:eastAsia="Microsoft YaHei"/>
+        </w:rPr>
+        <w:t>现象</w:t>
+      </w:r>
+    </w:p>
+    <w:p>
+      <w:r>
+        <w:rPr>
+          <w:rFonts w:ascii="Aptos" w:hAnsi="Aptos" w:eastAsia="Microsoft YaHei"/>
+        </w:rPr>
+        <w:t>报纸式、多栏式或左右对话式正文被转换成 Markdown 表格，造成句子断裂、阅读顺序错误和大量无意义单元格。</w:t>
+      </w:r>
+    </w:p>
+    <w:p>
+      <w:pPr>
+        <w:pStyle w:val="Heading2"/>
+      </w:pPr>
+      <w:r>
+        <w:rPr>
+          <w:rFonts w:ascii="Aptos" w:hAnsi="Aptos" w:eastAsia="Microsoft YaHei"/>
+        </w:rPr>
+        <w:t>已确认样本</w:t>
+      </w:r>
+    </w:p>
+    <w:p>
+      <w:pPr>
+        <w:ind w:left="397" w:hanging="255"/>
+      </w:pPr>
+      <w:r>
+        <w:rPr>
+          <w:rFonts w:ascii="Aptos" w:hAnsi="Aptos" w:eastAsia="Microsoft YaHei"/>
+        </w:rPr>
+        <w:t>1. 第一批 12-theatre-script.pdf 第 3 页。</w:t>
+      </w:r>
+    </w:p>
+    <w:p>
+      <w:pPr>
+        <w:ind w:left="397" w:hanging="255"/>
+      </w:pPr>
+      <w:r>
+        <w:rPr>
+          <w:rFonts w:ascii="Aptos" w:hAnsi="Aptos" w:eastAsia="Microsoft YaHei"/>
+        </w:rPr>
+        <w:t>2. 第一批 07-multicolumn-dictionary.pdf 第 218、278、285、405 页。</w:t>
+      </w:r>
+    </w:p>
+    <w:p>
+      <w:pPr>
+        <w:ind w:left="397" w:hanging="255"/>
+      </w:pPr>
+      <w:r>
+        <w:rPr>
+          <w:rFonts w:ascii="Aptos" w:hAnsi="Aptos" w:eastAsia="Microsoft YaHei"/>
+        </w:rPr>
+        <w:t>3. 第一批 18-large-print-novel.pdf 第 27、105、152、252 页。</w:t>
+      </w:r>
+    </w:p>
+    <w:p>
+      <w:pPr>
+        <w:ind w:left="397" w:hanging="255"/>
+      </w:pPr>
+      <w:r>
+        <w:rPr>
+          <w:rFonts w:ascii="Aptos" w:hAnsi="Aptos" w:eastAsia="Microsoft YaHei"/>
+        </w:rPr>
+        <w:t>4. 第一批 03-magazine-recast.pdf 第 2 页输出了表格行。</w:t>
+      </w:r>
+    </w:p>
+    <w:p>
+      <w:pPr>
+        <w:pStyle w:val="Heading2"/>
+      </w:pPr>
+      <w:r>
+        <w:rPr>
+          <w:rFonts w:ascii="Aptos" w:hAnsi="Aptos" w:eastAsia="Microsoft YaHei"/>
+        </w:rPr>
         <w:t>原因判断</w:t>
       </w:r>
     </w:p>
@@ -1806,7 +2161,7 @@
         <w:rPr>
           <w:rFonts w:ascii="Aptos" w:hAnsi="Aptos" w:eastAsia="Microsoft YaHei"/>
         </w:rPr>
-        <w:t>页面标记目前更接近“有可输出文本的页面标记”，而不是“源 PDF 物理页面标记”。这会破坏引用页码、逐页对比和回归测试。</w:t>
+        <w:t>启发式表格检测对“多条竖向对齐的文本块”权重过高，没有充分区分表格、词典栏、戏剧角色对白、分栏小说和杂志正文。</w:t>
       </w:r>
     </w:p>
     <w:p>
@@ -1828,7 +2183,7 @@
         <w:rPr>
           <w:rFonts w:ascii="Aptos" w:hAnsi="Aptos" w:eastAsia="Microsoft YaHei"/>
         </w:rPr>
-        <w:t>1. 明确 --pages 的规则：为源文件的每个物理页面输出一个标记。</w:t>
+        <w:t>1. 在表格判定前先使用 newspaper/tabular 分类结果。</w:t>
       </w:r>
     </w:p>
     <w:p>
@@ -1839,7 +2194,7 @@
         <w:rPr>
           <w:rFonts w:ascii="Aptos" w:hAnsi="Aptos" w:eastAsia="Microsoft YaHei"/>
         </w:rPr>
-        <w:t>2. 无可提取文本时仍输出 &lt;!-- Page N --&gt;。</w:t>
+        <w:t>2. 对句子型文本增加否决条件，例如高标点密度、连续长句、跨行自然续写和段落缩进。</w:t>
       </w:r>
     </w:p>
     <w:p>
@@ -1850,7 +2205,7 @@
         <w:rPr>
           <w:rFonts w:ascii="Aptos" w:hAnsi="Aptos" w:eastAsia="Microsoft YaHei"/>
         </w:rPr>
-        <w:t>3. 可选地追加 &lt;!-- No extractable text --&gt; 或 &lt;!-- OCR required --&gt;，但不要改变页码。</w:t>
+        <w:t>3. 要求候选表格至少有多行重复的列边界或明显的横纵分隔证据。</w:t>
       </w:r>
     </w:p>
     <w:p>
@@ -1861,7 +2216,18 @@
         <w:rPr>
           <w:rFonts w:ascii="Aptos" w:hAnsi="Aptos" w:eastAsia="Microsoft YaHei"/>
         </w:rPr>
-        <w:t>4. 继续保持所有对外页码从 1 开始。</w:t>
+        <w:t>4. 对词典、戏剧和小说版式增加负样本回归测试。</w:t>
+      </w:r>
+    </w:p>
+    <w:p>
+      <w:pPr>
+        <w:ind w:left="397" w:hanging="255"/>
+      </w:pPr>
+      <w:r>
+        <w:rPr>
+          <w:rFonts w:ascii="Aptos" w:hAnsi="Aptos" w:eastAsia="Microsoft YaHei"/>
+        </w:rPr>
+        <w:t>5. 将启发式表格置信度写入调试日志，便于定位触发条件。</w:t>
       </w:r>
     </w:p>
     <w:p>
@@ -1883,7 +2249,7 @@
         <w:rPr>
           <w:rFonts w:ascii="Aptos" w:hAnsi="Aptos" w:eastAsia="Microsoft YaHei"/>
         </w:rPr>
-        <w:t>1. 启用 --pages 时，标记数量等于 page_count。</w:t>
+        <w:t>1. 上述正文页不再生成 Markdown 表格。</w:t>
       </w:r>
     </w:p>
     <w:p>
@@ -1894,7 +2260,7 @@
         <w:rPr>
           <w:rFonts w:ascii="Aptos" w:hAnsi="Aptos" w:eastAsia="Microsoft YaHei"/>
         </w:rPr>
-        <w:t>2. 标记从 1 连续递增到 page_count，无重复、无缺号。</w:t>
+        <w:t>2. 发票、税表、问卷和实际网格表格仍能正确输出。</w:t>
       </w:r>
     </w:p>
     <w:p>
@@ -1905,7 +2271,205 @@
         <w:rPr>
           <w:rFonts w:ascii="Aptos" w:hAnsi="Aptos" w:eastAsia="Microsoft YaHei"/>
         </w:rPr>
-        <w:t>3. 纯图片页和空白页也保留页码位置。</w:t>
+        <w:t>3. 表格召回率不因修复出现明显下降。</w:t>
+      </w:r>
+    </w:p>
+    <w:p>
+      <w:pPr>
+        <w:pStyle w:val="Heading2"/>
+      </w:pPr>
+      <w:r>
+        <w:rPr>
+          <w:rFonts w:ascii="Aptos" w:hAnsi="Aptos" w:eastAsia="Microsoft YaHei"/>
+        </w:rPr>
+        <w:t>实际修复方法</w:t>
+      </w:r>
+    </w:p>
+    <w:p>
+      <w:pPr>
+        <w:ind w:left="397" w:hanging="255"/>
+      </w:pPr>
+      <w:r>
+        <w:rPr>
+          <w:rFonts w:ascii="Aptos" w:hAnsi="Aptos" w:eastAsia="Microsoft YaHei"/>
+        </w:rPr>
+        <w:t>1. 扩展段落否决规则，识别稀疏中间锚点、短单词碎片、两行引文和密集多栏长句，避免仅凭 X 坐标对齐生成启发式表格。</w:t>
+      </w:r>
+    </w:p>
+    <w:p>
+      <w:pPr>
+        <w:ind w:left="397" w:hanging="255"/>
+      </w:pPr>
+      <w:r>
+        <w:rPr>
+          <w:rFonts w:ascii="Aptos" w:hAnsi="Aptos" w:eastAsia="Microsoft YaHei"/>
+        </w:rPr>
+        <w:t>2. 线框检测仅在候选网格填充密度较高且单元格呈持续长句时拒绝候选；低密度填写表单继续保留，避免空白填写区被当作正文。</w:t>
+      </w:r>
+    </w:p>
+    <w:p>
+      <w:pPr>
+        <w:ind w:left="397" w:hanging="255"/>
+      </w:pPr>
+      <w:r>
+        <w:rPr>
+          <w:rFonts w:ascii="Aptos" w:hAnsi="Aptos" w:eastAsia="Microsoft YaHei"/>
+        </w:rPr>
+        <w:t>3. 对仅占页面一部分但结构自身完整的双列标签表格放宽页面覆盖率限制；要求至少 3 行、每行两列基本填满且每个非空单元格均有匹配文本。</w:t>
+      </w:r>
+    </w:p>
+    <w:p>
+      <w:pPr>
+        <w:ind w:left="397" w:hanging="255"/>
+      </w:pPr>
+      <w:r>
+        <w:rPr>
+          <w:rFonts w:ascii="Aptos" w:hAnsi="Aptos" w:eastAsia="Microsoft YaHei"/>
+        </w:rPr>
+        <w:t>4. 新增 7 个定向单元测试，覆盖四类正文误判、带数据的稀疏真表格、完整双列标签表和不完整标签结构。</w:t>
+      </w:r>
+    </w:p>
+    <w:p>
+      <w:pPr>
+        <w:ind w:left="397" w:hanging="255"/>
+      </w:pPr>
+      <w:r>
+        <w:rPr>
+          <w:rFonts w:ascii="Aptos" w:hAnsi="Aptos" w:eastAsia="Microsoft YaHei"/>
+        </w:rPr>
+        <w:t>5. 使用原始 PDF 页面渲染核对杂志、OSHA 说明页、W-9 双列表和香港预算表，防止仅根据 Markdown 行数判断结果。</w:t>
+      </w:r>
+    </w:p>
+    <w:p>
+      <w:pPr>
+        <w:pStyle w:val="Heading2"/>
+      </w:pPr>
+      <w:r>
+        <w:rPr>
+          <w:rFonts w:ascii="Aptos" w:hAnsi="Aptos" w:eastAsia="Microsoft YaHei"/>
+        </w:rPr>
+        <w:t>修复结果</w:t>
+      </w:r>
+    </w:p>
+    <w:p>
+      <w:pPr>
+        <w:ind w:left="397" w:hanging="255"/>
+      </w:pPr>
+      <w:r>
+        <w:rPr>
+          <w:rFonts w:ascii="Aptos" w:hAnsi="Aptos" w:eastAsia="Microsoft YaHei"/>
+        </w:rPr>
+        <w:t>1. 10 个已登记误判页全部不再生成 Markdown 表格：戏剧第 3 页；词典第 218、278、285、405 页；小说第 27、105、152、252 页；杂志第 2 页。</w:t>
+      </w:r>
+    </w:p>
+    <w:p>
+      <w:pPr>
+        <w:ind w:left="397" w:hanging="255"/>
+      </w:pPr>
+      <w:r>
+        <w:rPr>
+          <w:rFonts w:ascii="Aptos" w:hAnsi="Aptos" w:eastAsia="Microsoft YaHei"/>
+        </w:rPr>
+        <w:t>2. 额外清除了诗集、扫描杂志、人口普查问卷和 OSHA 说明页中的同类正文误判；40 份样本的 Markdown 表格行由 826 行降至 647 行。</w:t>
+      </w:r>
+    </w:p>
+    <w:p>
+      <w:pPr>
+        <w:ind w:left="397" w:hanging="255"/>
+      </w:pPr>
+      <w:r>
+        <w:rPr>
+          <w:rFonts w:ascii="Aptos" w:hAnsi="Aptos" w:eastAsia="Microsoft YaHei"/>
+        </w:rPr>
+        <w:t>3. W-9 第 3、4、5 页的完整双列表按标签结构输出，第 5 页两张表不再吸收旁边的身份盗用说明；该文件的正确表格行由旧的 12 行改善为 34 行。</w:t>
+      </w:r>
+    </w:p>
+    <w:p>
+      <w:pPr>
+        <w:ind w:left="397" w:hanging="255"/>
+      </w:pPr>
+      <w:r>
+        <w:rPr>
+          <w:rFonts w:ascii="Aptos" w:hAnsi="Aptos" w:eastAsia="Microsoft YaHei"/>
+        </w:rPr>
+        <w:t>4. 香港预算表第 28 页继续保留 5 行 Markdown 表格；发票、报税表、问卷和其他网格表格的定向检查通过。</w:t>
+      </w:r>
+    </w:p>
+    <w:p>
+      <w:pPr>
+        <w:ind w:left="397" w:hanging="255"/>
+      </w:pPr>
+      <w:r>
+        <w:rPr>
+          <w:rFonts w:ascii="Aptos" w:hAnsi="Aptos" w:eastAsia="Microsoft YaHei"/>
+        </w:rPr>
+        <w:t>5. 完整 40 份回归结果：40 份检测成功，37 份直接转换，3 份进入 OCR，0 份被拒绝；输出 4,328,894 个字符，U+FFFD 为 381 个，全部来自既有的香港双语表单问题。</w:t>
+      </w:r>
+    </w:p>
+    <w:p>
+      <w:pPr>
+        <w:ind w:left="397" w:hanging="255"/>
+      </w:pPr>
+      <w:r>
+        <w:rPr>
+          <w:rFonts w:ascii="Aptos" w:hAnsi="Aptos" w:eastAsia="Microsoft YaHei"/>
+        </w:rPr>
+        <w:t>6. 回归输出保存在 test_output/all-40-after-pdf-003/，由 Git 忽略，不进入仓库。</w:t>
+      </w:r>
+    </w:p>
+    <w:p>
+      <w:pPr>
+        <w:pStyle w:val="Heading2"/>
+      </w:pPr>
+      <w:r>
+        <w:rPr>
+          <w:rFonts w:ascii="Aptos" w:hAnsi="Aptos" w:eastAsia="Microsoft YaHei"/>
+        </w:rPr>
+        <w:t>验证记录</w:t>
+      </w:r>
+    </w:p>
+    <w:p>
+      <w:pPr>
+        <w:pStyle w:val="ListBullet"/>
+      </w:pPr>
+      <w:r>
+        <w:rPr>
+          <w:rFonts w:ascii="Aptos" w:hAnsi="Aptos" w:eastAsia="Microsoft YaHei"/>
+        </w:rPr>
+        <w:t>cargo fmt --all -- --check：通过。</w:t>
+      </w:r>
+    </w:p>
+    <w:p>
+      <w:pPr>
+        <w:pStyle w:val="ListBullet"/>
+      </w:pPr>
+      <w:r>
+        <w:rPr>
+          <w:rFonts w:ascii="Aptos" w:hAnsi="Aptos" w:eastAsia="Microsoft YaHei"/>
+        </w:rPr>
+        <w:t>cargo clippy --offline -- -D warnings：通过，0 个 Clippy 警告。</w:t>
+      </w:r>
+    </w:p>
+    <w:p>
+      <w:pPr>
+        <w:pStyle w:val="ListBullet"/>
+      </w:pPr>
+      <w:r>
+        <w:rPr>
+          <w:rFonts w:ascii="Aptos" w:hAnsi="Aptos" w:eastAsia="Microsoft YaHei"/>
+        </w:rPr>
+        <w:t>cargo test --offline：通过，共 876 项（728 项库单元测试、1 项命令测试、145 项集成测试、2 项文档测试），0 项失败。</w:t>
+      </w:r>
+    </w:p>
+    <w:p>
+      <w:pPr>
+        <w:pStyle w:val="ListBullet"/>
+      </w:pPr>
+      <w:r>
+        <w:rPr>
+          <w:rFonts w:ascii="Aptos" w:hAnsi="Aptos" w:eastAsia="Microsoft YaHei"/>
+        </w:rPr>
+        <w:t>cargo build --release --offline：通过。</w:t>
       </w:r>
     </w:p>
     <w:p>
@@ -1916,7 +2480,7 @@
         <w:rPr>
           <w:rFonts w:ascii="Aptos" w:hAnsi="Aptos" w:eastAsia="Microsoft YaHei"/>
         </w:rPr>
-        <w:t>3. PDF-003：多栏正文被误判为 Markdown 表格</w:t>
+        <w:t>4. PDF-004：检测器与转换器的表格判断不一致</w:t>
       </w:r>
     </w:p>
     <w:p>
@@ -1938,7 +2502,7 @@
         <w:rPr>
           <w:rFonts w:ascii="Aptos" w:hAnsi="Aptos" w:eastAsia="Microsoft YaHei"/>
         </w:rPr>
-        <w:t>修复时间：2026-09-06 23:08:00（Asia/Shanghai）</w:t>
+        <w:t>修复时间：2026-09-07（Asia/Shanghai）</w:t>
       </w:r>
     </w:p>
     <w:p>
@@ -1949,7 +2513,7 @@
         <w:rPr>
           <w:rFonts w:ascii="Aptos" w:hAnsi="Aptos" w:eastAsia="Microsoft YaHei"/>
         </w:rPr>
-        <w:t>级别：高</w:t>
+        <w:t>级别：中</w:t>
       </w:r>
     </w:p>
     <w:p>
@@ -1960,18 +2524,7 @@
         <w:rPr>
           <w:rFonts w:ascii="Aptos" w:hAnsi="Aptos" w:eastAsia="Microsoft YaHei"/>
         </w:rPr>
-        <w:t>状态：已关闭（实现完成并通过真实样本回归）</w:t>
-      </w:r>
-    </w:p>
-    <w:p>
-      <w:pPr>
-        <w:pStyle w:val="ListBullet"/>
-      </w:pPr>
-      <w:r>
-        <w:rPr>
-          <w:rFonts w:ascii="Aptos" w:hAnsi="Aptos" w:eastAsia="Microsoft YaHei"/>
-        </w:rPr>
-        <w:t>影响模块：src/tables/detect_heuristic.rs、src/tables/detect_lines.rs、src/markdown/mod.rs</w:t>
+        <w:t>状态：已关闭（目标样本复测一致）</w:t>
       </w:r>
     </w:p>
     <w:p>
@@ -1986,11 +2539,12 @@
       </w:r>
     </w:p>
     <w:p>
-      <w:r>
-        <w:rPr>
-          <w:rFonts w:ascii="Aptos" w:hAnsi="Aptos" w:eastAsia="Microsoft YaHei"/>
-        </w:rPr>
-        <w:t>报纸式、多栏式或左右对话式正文被转换成 Markdown 表格，造成句子断裂、阅读顺序错误和大量无意义单元格。</w:t>
+      <w:pPr/>
+      <w:r>
+        <w:rPr>
+          <w:rFonts w:ascii="Aptos" w:hAnsi="Aptos" w:eastAsia="Microsoft YaHei"/>
+        </w:rPr>
+        <w:t>03-magazine-recast.pdf 的布局分析曾返回无表格页，但 Markdown 第 2 页出现 8 行伪表格。</w:t>
       </w:r>
     </w:p>
     <w:p>
@@ -2001,7 +2555,27 @@
         <w:rPr>
           <w:rFonts w:ascii="Aptos" w:hAnsi="Aptos" w:eastAsia="Microsoft YaHei"/>
         </w:rPr>
-        <w:t>已确认样本</w:t>
+        <w:t>已确认原因</w:t>
+      </w:r>
+    </w:p>
+    <w:p>
+      <w:pPr/>
+      <w:r>
+        <w:rPr>
+          <w:rFonts w:ascii="Aptos" w:hAnsi="Aptos" w:eastAsia="Microsoft YaHei"/>
+        </w:rPr>
+        <w:t>第 2 页多栏正文曾触发 Markdown 启发式表格误判，而布局分析没有把该候选识别为数据表。该问题属于 PDF-003 的多栏正文误判。</w:t>
+      </w:r>
+    </w:p>
+    <w:p>
+      <w:pPr>
+        <w:pStyle w:val="Heading2"/>
+      </w:pPr>
+      <w:r>
+        <w:rPr>
+          <w:rFonts w:ascii="Aptos" w:hAnsi="Aptos" w:eastAsia="Microsoft YaHei"/>
+        </w:rPr>
+        <w:t>已实施修复</w:t>
       </w:r>
     </w:p>
     <w:p>
@@ -2012,7 +2586,7 @@
         <w:rPr>
           <w:rFonts w:ascii="Aptos" w:hAnsi="Aptos" w:eastAsia="Microsoft YaHei"/>
         </w:rPr>
-        <w:t>1. 第一批 12-theatre-script.pdf 第 3 页。</w:t>
+        <w:t>1. PDF-003 的平行正文拒绝规则同时消除了该页的伪表格候选。</w:t>
       </w:r>
     </w:p>
     <w:p>
@@ -2023,7 +2597,7 @@
         <w:rPr>
           <w:rFonts w:ascii="Aptos" w:hAnsi="Aptos" w:eastAsia="Microsoft YaHei"/>
         </w:rPr>
-        <w:t>2. 第一批 07-multicolumn-dictionary.pdf 第 218、278、285、405 页。</w:t>
+        <w:t>2. pages_with_tables 继续只记录真实数据表，目录和多栏正文不进入该集合。</w:t>
       </w:r>
     </w:p>
     <w:p>
@@ -2034,18 +2608,7 @@
         <w:rPr>
           <w:rFonts w:ascii="Aptos" w:hAnsi="Aptos" w:eastAsia="Microsoft YaHei"/>
         </w:rPr>
-        <w:t>3. 第一批 18-large-print-novel.pdf 第 27、105、152、252 页。</w:t>
-      </w:r>
-    </w:p>
-    <w:p>
-      <w:pPr>
-        <w:ind w:left="397" w:hanging="255"/>
-      </w:pPr>
-      <w:r>
-        <w:rPr>
-          <w:rFonts w:ascii="Aptos" w:hAnsi="Aptos" w:eastAsia="Microsoft YaHei"/>
-        </w:rPr>
-        <w:t>4. 第一批 03-magazine-recast.pdf 第 2 页输出了表格行。</w:t>
+        <w:t>3. 对目标文件同时执行布局分析和 Markdown 转换并比较结果。</w:t>
       </w:r>
     </w:p>
     <w:p>
@@ -2056,479 +2619,16 @@
         <w:rPr>
           <w:rFonts w:ascii="Aptos" w:hAnsi="Aptos" w:eastAsia="Microsoft YaHei"/>
         </w:rPr>
-        <w:t>原因判断</w:t>
-      </w:r>
-    </w:p>
-    <w:p>
-      <w:r>
-        <w:rPr>
-          <w:rFonts w:ascii="Aptos" w:hAnsi="Aptos" w:eastAsia="Microsoft YaHei"/>
-        </w:rPr>
-        <w:t>启发式表格检测对“多条竖向对齐的文本块”权重过高，没有充分区分表格、词典栏、戏剧角色对白、分栏小说和杂志正文。</w:t>
-      </w:r>
-    </w:p>
-    <w:p>
-      <w:pPr>
-        <w:pStyle w:val="Heading2"/>
-      </w:pPr>
-      <w:r>
-        <w:rPr>
-          <w:rFonts w:ascii="Aptos" w:hAnsi="Aptos" w:eastAsia="Microsoft YaHei"/>
-        </w:rPr>
-        <w:t>解决方案</w:t>
-      </w:r>
-    </w:p>
-    <w:p>
-      <w:pPr>
-        <w:ind w:left="397" w:hanging="255"/>
-      </w:pPr>
-      <w:r>
-        <w:rPr>
-          <w:rFonts w:ascii="Aptos" w:hAnsi="Aptos" w:eastAsia="Microsoft YaHei"/>
-        </w:rPr>
-        <w:t>1. 在表格判定前先使用 newspaper/tabular 分类结果。</w:t>
-      </w:r>
-    </w:p>
-    <w:p>
-      <w:pPr>
-        <w:ind w:left="397" w:hanging="255"/>
-      </w:pPr>
-      <w:r>
-        <w:rPr>
-          <w:rFonts w:ascii="Aptos" w:hAnsi="Aptos" w:eastAsia="Microsoft YaHei"/>
-        </w:rPr>
-        <w:t>2. 对句子型文本增加否决条件，例如高标点密度、连续长句、跨行自然续写和段落缩进。</w:t>
-      </w:r>
-    </w:p>
-    <w:p>
-      <w:pPr>
-        <w:ind w:left="397" w:hanging="255"/>
-      </w:pPr>
-      <w:r>
-        <w:rPr>
-          <w:rFonts w:ascii="Aptos" w:hAnsi="Aptos" w:eastAsia="Microsoft YaHei"/>
-        </w:rPr>
-        <w:t>3. 要求候选表格至少有多行重复的列边界或明显的横纵分隔证据。</w:t>
-      </w:r>
-    </w:p>
-    <w:p>
-      <w:pPr>
-        <w:ind w:left="397" w:hanging="255"/>
-      </w:pPr>
-      <w:r>
-        <w:rPr>
-          <w:rFonts w:ascii="Aptos" w:hAnsi="Aptos" w:eastAsia="Microsoft YaHei"/>
-        </w:rPr>
-        <w:t>4. 对词典、戏剧和小说版式增加负样本回归测试。</w:t>
-      </w:r>
-    </w:p>
-    <w:p>
-      <w:pPr>
-        <w:ind w:left="397" w:hanging="255"/>
-      </w:pPr>
-      <w:r>
-        <w:rPr>
-          <w:rFonts w:ascii="Aptos" w:hAnsi="Aptos" w:eastAsia="Microsoft YaHei"/>
-        </w:rPr>
-        <w:t>5. 将启发式表格置信度写入调试日志，便于定位触发条件。</w:t>
-      </w:r>
-    </w:p>
-    <w:p>
-      <w:pPr>
-        <w:pStyle w:val="Heading2"/>
-      </w:pPr>
-      <w:r>
-        <w:rPr>
-          <w:rFonts w:ascii="Aptos" w:hAnsi="Aptos" w:eastAsia="Microsoft YaHei"/>
-        </w:rPr>
-        <w:t>验收标准</w:t>
-      </w:r>
-    </w:p>
-    <w:p>
-      <w:pPr>
-        <w:ind w:left="397" w:hanging="255"/>
-      </w:pPr>
-      <w:r>
-        <w:rPr>
-          <w:rFonts w:ascii="Aptos" w:hAnsi="Aptos" w:eastAsia="Microsoft YaHei"/>
-        </w:rPr>
-        <w:t>1. 上述正文页不再生成 Markdown 表格。</w:t>
-      </w:r>
-    </w:p>
-    <w:p>
-      <w:pPr>
-        <w:ind w:left="397" w:hanging="255"/>
-      </w:pPr>
-      <w:r>
-        <w:rPr>
-          <w:rFonts w:ascii="Aptos" w:hAnsi="Aptos" w:eastAsia="Microsoft YaHei"/>
-        </w:rPr>
-        <w:t>2. 发票、税表、问卷和实际网格表格仍能正确输出。</w:t>
-      </w:r>
-    </w:p>
-    <w:p>
-      <w:pPr>
-        <w:ind w:left="397" w:hanging="255"/>
-      </w:pPr>
-      <w:r>
-        <w:rPr>
-          <w:rFonts w:ascii="Aptos" w:hAnsi="Aptos" w:eastAsia="Microsoft YaHei"/>
-        </w:rPr>
-        <w:t>3. 表格召回率不因修复出现明显下降。</w:t>
-      </w:r>
-    </w:p>
-    <w:p>
-      <w:pPr>
-        <w:pStyle w:val="Heading2"/>
-      </w:pPr>
-      <w:r>
-        <w:rPr>
-          <w:rFonts w:ascii="Aptos" w:hAnsi="Aptos" w:eastAsia="Microsoft YaHei"/>
-        </w:rPr>
-        <w:t>实际修复方法</w:t>
-      </w:r>
-    </w:p>
-    <w:p>
-      <w:pPr>
-        <w:ind w:left="397" w:hanging="255"/>
-      </w:pPr>
-      <w:r>
-        <w:rPr>
-          <w:rFonts w:ascii="Aptos" w:hAnsi="Aptos" w:eastAsia="Microsoft YaHei"/>
-        </w:rPr>
-        <w:t>1. 扩展段落否决规则，识别稀疏中间锚点、短单词碎片、两行引文和密集多栏长句，避免仅凭 X 坐标对齐生成启发式表格。</w:t>
-      </w:r>
-    </w:p>
-    <w:p>
-      <w:pPr>
-        <w:ind w:left="397" w:hanging="255"/>
-      </w:pPr>
-      <w:r>
-        <w:rPr>
-          <w:rFonts w:ascii="Aptos" w:hAnsi="Aptos" w:eastAsia="Microsoft YaHei"/>
-        </w:rPr>
-        <w:t>2. 线框检测仅在候选网格填充密度较高且单元格呈持续长句时拒绝候选；低密度填写表单继续保留，避免空白填写区被当作正文。</w:t>
-      </w:r>
-    </w:p>
-    <w:p>
-      <w:pPr>
-        <w:ind w:left="397" w:hanging="255"/>
-      </w:pPr>
-      <w:r>
-        <w:rPr>
-          <w:rFonts w:ascii="Aptos" w:hAnsi="Aptos" w:eastAsia="Microsoft YaHei"/>
-        </w:rPr>
-        <w:t>3. 对仅占页面一部分但结构自身完整的双列标签表格放宽页面覆盖率限制；要求至少 3 行、每行两列基本填满且每个非空单元格均有匹配文本。</w:t>
-      </w:r>
-    </w:p>
-    <w:p>
-      <w:pPr>
-        <w:ind w:left="397" w:hanging="255"/>
-      </w:pPr>
-      <w:r>
-        <w:rPr>
-          <w:rFonts w:ascii="Aptos" w:hAnsi="Aptos" w:eastAsia="Microsoft YaHei"/>
-        </w:rPr>
-        <w:t>4. 新增 7 个定向单元测试，覆盖四类正文误判、带数据的稀疏真表格、完整双列标签表和不完整标签结构。</w:t>
-      </w:r>
-    </w:p>
-    <w:p>
-      <w:pPr>
-        <w:ind w:left="397" w:hanging="255"/>
-      </w:pPr>
-      <w:r>
-        <w:rPr>
-          <w:rFonts w:ascii="Aptos" w:hAnsi="Aptos" w:eastAsia="Microsoft YaHei"/>
-        </w:rPr>
-        <w:t>5. 使用原始 PDF 页面渲染核对杂志、OSHA 说明页、W-9 双列表和香港预算表，防止仅根据 Markdown 行数判断结果。</w:t>
-      </w:r>
-    </w:p>
-    <w:p>
-      <w:pPr>
-        <w:pStyle w:val="Heading2"/>
-      </w:pPr>
-      <w:r>
-        <w:rPr>
-          <w:rFonts w:ascii="Aptos" w:hAnsi="Aptos" w:eastAsia="Microsoft YaHei"/>
-        </w:rPr>
         <w:t>修复结果</w:t>
       </w:r>
     </w:p>
     <w:p>
-      <w:pPr>
-        <w:ind w:left="397" w:hanging="255"/>
-      </w:pPr>
-      <w:r>
-        <w:rPr>
-          <w:rFonts w:ascii="Aptos" w:hAnsi="Aptos" w:eastAsia="Microsoft YaHei"/>
-        </w:rPr>
-        <w:t>1. 10 个已登记误判页全部不再生成 Markdown 表格：戏剧第 3 页；词典第 218、278、285、405 页；小说第 27、105、152、252 页；杂志第 2 页。</w:t>
-      </w:r>
-    </w:p>
-    <w:p>
-      <w:pPr>
-        <w:ind w:left="397" w:hanging="255"/>
-      </w:pPr>
-      <w:r>
-        <w:rPr>
-          <w:rFonts w:ascii="Aptos" w:hAnsi="Aptos" w:eastAsia="Microsoft YaHei"/>
-        </w:rPr>
-        <w:t>2. 额外清除了诗集、扫描杂志、人口普查问卷和 OSHA 说明页中的同类正文误判；40 份样本的 Markdown 表格行由 826 行降至 647 行。</w:t>
-      </w:r>
-    </w:p>
-    <w:p>
-      <w:pPr>
-        <w:ind w:left="397" w:hanging="255"/>
-      </w:pPr>
-      <w:r>
-        <w:rPr>
-          <w:rFonts w:ascii="Aptos" w:hAnsi="Aptos" w:eastAsia="Microsoft YaHei"/>
-        </w:rPr>
-        <w:t>3. W-9 第 3、4、5 页的完整双列表按标签结构输出，第 5 页两张表不再吸收旁边的身份盗用说明；该文件的正确表格行由旧的 12 行改善为 34 行。</w:t>
-      </w:r>
-    </w:p>
-    <w:p>
-      <w:pPr>
-        <w:ind w:left="397" w:hanging="255"/>
-      </w:pPr>
-      <w:r>
-        <w:rPr>
-          <w:rFonts w:ascii="Aptos" w:hAnsi="Aptos" w:eastAsia="Microsoft YaHei"/>
-        </w:rPr>
-        <w:t>4. 香港预算表第 28 页继续保留 5 行 Markdown 表格；发票、报税表、问卷和其他网格表格的定向检查通过。</w:t>
-      </w:r>
-    </w:p>
-    <w:p>
-      <w:pPr>
-        <w:ind w:left="397" w:hanging="255"/>
-      </w:pPr>
-      <w:r>
-        <w:rPr>
-          <w:rFonts w:ascii="Aptos" w:hAnsi="Aptos" w:eastAsia="Microsoft YaHei"/>
-        </w:rPr>
-        <w:t>5. 完整 40 份回归结果：40 份检测成功，37 份直接转换，3 份进入 OCR，0 份被拒绝；输出 4,328,894 个字符，U+FFFD 为 381 个，全部来自既有的香港双语表单问题。</w:t>
-      </w:r>
-    </w:p>
-    <w:p>
-      <w:pPr>
-        <w:ind w:left="397" w:hanging="255"/>
-      </w:pPr>
-      <w:r>
-        <w:rPr>
-          <w:rFonts w:ascii="Aptos" w:hAnsi="Aptos" w:eastAsia="Microsoft YaHei"/>
-        </w:rPr>
-        <w:t>6. 回归输出保存在 test_output/all-40-after-pdf-003/，由 Git 忽略，不进入仓库。</w:t>
-      </w:r>
-    </w:p>
-    <w:p>
-      <w:pPr>
-        <w:pStyle w:val="Heading2"/>
-      </w:pPr>
-      <w:r>
-        <w:rPr>
-          <w:rFonts w:ascii="Aptos" w:hAnsi="Aptos" w:eastAsia="Microsoft YaHei"/>
-        </w:rPr>
-        <w:t>验证记录</w:t>
-      </w:r>
-    </w:p>
-    <w:p>
-      <w:pPr>
-        <w:pStyle w:val="ListBullet"/>
-      </w:pPr>
-      <w:r>
-        <w:rPr>
-          <w:rFonts w:ascii="Aptos" w:hAnsi="Aptos" w:eastAsia="Microsoft YaHei"/>
-        </w:rPr>
-        <w:t>cargo fmt --all -- --check：通过。</w:t>
-      </w:r>
-    </w:p>
-    <w:p>
-      <w:pPr>
-        <w:pStyle w:val="ListBullet"/>
-      </w:pPr>
-      <w:r>
-        <w:rPr>
-          <w:rFonts w:ascii="Aptos" w:hAnsi="Aptos" w:eastAsia="Microsoft YaHei"/>
-        </w:rPr>
-        <w:t>cargo clippy --offline -- -D warnings：通过，0 个 Clippy 警告。</w:t>
-      </w:r>
-    </w:p>
-    <w:p>
-      <w:pPr>
-        <w:pStyle w:val="ListBullet"/>
-      </w:pPr>
-      <w:r>
-        <w:rPr>
-          <w:rFonts w:ascii="Aptos" w:hAnsi="Aptos" w:eastAsia="Microsoft YaHei"/>
-        </w:rPr>
-        <w:t>cargo test --offline：通过，共 876 项（728 项库单元测试、1 项命令测试、145 项集成测试、2 项文档测试），0 项失败。</w:t>
-      </w:r>
-    </w:p>
-    <w:p>
-      <w:pPr>
-        <w:pStyle w:val="ListBullet"/>
-      </w:pPr>
-      <w:r>
-        <w:rPr>
-          <w:rFonts w:ascii="Aptos" w:hAnsi="Aptos" w:eastAsia="Microsoft YaHei"/>
-        </w:rPr>
-        <w:t>cargo build --release --offline：通过。</w:t>
-      </w:r>
-    </w:p>
-    <w:p>
-      <w:pPr>
-        <w:pStyle w:val="Heading1"/>
-      </w:pPr>
-      <w:r>
-        <w:rPr>
-          <w:rFonts w:ascii="Aptos" w:hAnsi="Aptos" w:eastAsia="Microsoft YaHei"/>
-        </w:rPr>
-        <w:t>4. PDF-004：检测器与转换器的表格判断不一致</w:t>
-      </w:r>
-    </w:p>
-    <w:p>
-      <w:pPr>
-        <w:pStyle w:val="ListBullet"/>
-      </w:pPr>
-      <w:r>
-        <w:rPr>
-          <w:rFonts w:ascii="Aptos" w:hAnsi="Aptos" w:eastAsia="Microsoft YaHei"/>
-        </w:rPr>
-        <w:t>发现时间：2026-09-06</w:t>
-      </w:r>
-    </w:p>
-    <w:p>
-      <w:pPr>
-        <w:pStyle w:val="ListBullet"/>
-      </w:pPr>
-      <w:r>
-        <w:rPr>
-          <w:rFonts w:ascii="Aptos" w:hAnsi="Aptos" w:eastAsia="Microsoft YaHei"/>
-        </w:rPr>
-        <w:t>级别：中</w:t>
-      </w:r>
-    </w:p>
-    <w:p>
-      <w:pPr>
-        <w:pStyle w:val="ListBullet"/>
-      </w:pPr>
-      <w:r>
-        <w:rPr>
-          <w:rFonts w:ascii="Aptos" w:hAnsi="Aptos" w:eastAsia="Microsoft YaHei"/>
-        </w:rPr>
-        <w:t>状态：待修复</w:t>
-      </w:r>
-    </w:p>
-    <w:p>
-      <w:pPr>
-        <w:pStyle w:val="ListBullet"/>
-      </w:pPr>
-      <w:r>
-        <w:rPr>
-          <w:rFonts w:ascii="Aptos" w:hAnsi="Aptos" w:eastAsia="Microsoft YaHei"/>
-        </w:rPr>
-        <w:t>影响模块：src/detector.rs、表格检测入口、Markdown 转换入口</w:t>
-      </w:r>
-    </w:p>
-    <w:p>
-      <w:pPr>
-        <w:pStyle w:val="Heading2"/>
-      </w:pPr>
-      <w:r>
-        <w:rPr>
-          <w:rFonts w:ascii="Aptos" w:hAnsi="Aptos" w:eastAsia="Microsoft YaHei"/>
-        </w:rPr>
-        <w:t>现象</w:t>
-      </w:r>
-    </w:p>
-    <w:p>
-      <w:r>
-        <w:rPr>
-          <w:rFonts w:ascii="Aptos" w:hAnsi="Aptos" w:eastAsia="Microsoft YaHei"/>
-        </w:rPr>
-        <w:t>第一批 03-magazine-recast.pdf 的 detect-pdf --analyze --json 返回没有表格页，但 pdf2md 在第 2 页生成了 8 行 Markdown 表格。</w:t>
-      </w:r>
-    </w:p>
-    <w:p>
-      <w:pPr>
-        <w:pStyle w:val="Heading2"/>
-      </w:pPr>
-      <w:r>
-        <w:rPr>
-          <w:rFonts w:ascii="Aptos" w:hAnsi="Aptos" w:eastAsia="Microsoft YaHei"/>
-        </w:rPr>
-        <w:t>原因判断</w:t>
-      </w:r>
-    </w:p>
-    <w:p>
-      <w:r>
-        <w:rPr>
-          <w:rFonts w:ascii="Aptos" w:hAnsi="Aptos" w:eastAsia="Microsoft YaHei"/>
-        </w:rPr>
-        <w:t>检测命令和转换命令可能使用了不同的表格检测条件、预处理结果或后处理回退路径。</w:t>
-      </w:r>
-    </w:p>
-    <w:p>
-      <w:pPr>
-        <w:pStyle w:val="Heading2"/>
-      </w:pPr>
-      <w:r>
-        <w:rPr>
-          <w:rFonts w:ascii="Aptos" w:hAnsi="Aptos" w:eastAsia="Microsoft YaHei"/>
-        </w:rPr>
-        <w:t>解决方案</w:t>
-      </w:r>
-    </w:p>
-    <w:p>
-      <w:pPr>
-        <w:ind w:left="397" w:hanging="255"/>
-      </w:pPr>
-      <w:r>
-        <w:rPr>
-          <w:rFonts w:ascii="Aptos" w:hAnsi="Aptos" w:eastAsia="Microsoft YaHei"/>
-        </w:rPr>
-        <w:t>1. 将表格检测封装为共享结果，检测器和转换器消费同一个结构。</w:t>
-      </w:r>
-    </w:p>
-    <w:p>
-      <w:pPr>
-        <w:ind w:left="397" w:hanging="255"/>
-      </w:pPr>
-      <w:r>
-        <w:rPr>
-          <w:rFonts w:ascii="Aptos" w:hAnsi="Aptos" w:eastAsia="Microsoft YaHei"/>
-        </w:rPr>
-        <w:t>2. 如果转换阶段允许二次发现表格，应同步更新最终分析信息。</w:t>
-      </w:r>
-    </w:p>
-    <w:p>
-      <w:pPr>
-        <w:ind w:left="397" w:hanging="255"/>
-      </w:pPr>
-      <w:r>
-        <w:rPr>
-          <w:rFonts w:ascii="Aptos" w:hAnsi="Aptos" w:eastAsia="Microsoft YaHei"/>
-        </w:rPr>
-        <w:t>3. 增加断言：转换结果出现表格时，对应页面必须出现在最终 pages_with_tables 中。</w:t>
-      </w:r>
-    </w:p>
-    <w:p>
-      <w:pPr>
-        <w:pStyle w:val="Heading2"/>
-      </w:pPr>
-      <w:r>
-        <w:rPr>
-          <w:rFonts w:ascii="Aptos" w:hAnsi="Aptos" w:eastAsia="Microsoft YaHei"/>
-        </w:rPr>
-        <w:t>验收标准</w:t>
-      </w:r>
-    </w:p>
-    <w:p>
-      <w:r>
-        <w:rPr>
-          <w:rFonts w:ascii="Aptos" w:hAnsi="Aptos" w:eastAsia="Microsoft YaHei"/>
-        </w:rPr>
-        <w:t>同一文件、同一组选项下，检测结果与最终转换采用的表格页集合一致。</w:t>
+      <w:pPr/>
+      <w:r>
+        <w:rPr>
+          <w:rFonts w:ascii="Aptos" w:hAnsi="Aptos" w:eastAsia="Microsoft YaHei"/>
+        </w:rPr>
+        <w:t>检测和转换均成功；pages_with_tables 为空，Markdown 表格行为 0，第 2 页不再出现伪表格。</w:t>
       </w:r>
     </w:p>
     <w:p>
@@ -3681,9 +3781,6 @@
         <w:pStyle w:val="Heading1"/>
       </w:pPr>
       <w:r>
-        <w:rPr>
-          <w:rFonts w:ascii="Aptos" w:hAnsi="Aptos" w:eastAsia="Microsoft YaHei"/>
-        </w:rPr>
         <w:t>8. PDF-008：特殊字形产生大量重复警告</w:t>
       </w:r>
     </w:p>
@@ -3706,6 +3803,17 @@
         <w:rPr>
           <w:rFonts w:ascii="Aptos" w:hAnsi="Aptos" w:eastAsia="Microsoft YaHei"/>
         </w:rPr>
+        <w:t>修复时间：2026-09-07（Asia/Shanghai）</w:t>
+      </w:r>
+    </w:p>
+    <w:p>
+      <w:pPr>
+        <w:pStyle w:val="ListBullet"/>
+      </w:pPr>
+      <w:r>
+        <w:rPr>
+          <w:rFonts w:ascii="Aptos" w:hAnsi="Aptos" w:eastAsia="Microsoft YaHei"/>
+        </w:rPr>
         <w:t>级别：中</w:t>
       </w:r>
     </w:p>
@@ -3717,7 +3825,123 @@
         <w:rPr>
           <w:rFonts w:ascii="Aptos" w:hAnsi="Aptos" w:eastAsia="Microsoft YaHei"/>
         </w:rPr>
-        <w:t>状态：待修复</w:t>
+        <w:t>状态：已关闭（PDF-006 字形修复覆盖并通过目标样本回归）</w:t>
+      </w:r>
+    </w:p>
+    <w:p>
+      <w:pPr>
+        <w:pStyle w:val="Heading2"/>
+      </w:pPr>
+      <w:r>
+        <w:rPr>
+          <w:rFonts w:ascii="Aptos" w:hAnsi="Aptos" w:eastAsia="Microsoft YaHei"/>
+        </w:rPr>
+        <w:t>现象</w:t>
+      </w:r>
+    </w:p>
+    <w:p>
+      <w:pPr/>
+      <w:r>
+        <w:rPr>
+          <w:rFonts w:ascii="Aptos" w:hAnsi="Aptos" w:eastAsia="Microsoft YaHei"/>
+        </w:rPr>
+        <w:t>09-historical-essay.pdf 可转换 408 页，但曾重复输出 InvalidEncodingDifferenceGlyph 和完整字体字典。</w:t>
+      </w:r>
+    </w:p>
+    <w:p>
+      <w:pPr>
+        <w:pStyle w:val="Heading2"/>
+      </w:pPr>
+      <w:r>
+        <w:rPr>
+          <w:rFonts w:ascii="Aptos" w:hAnsi="Aptos" w:eastAsia="Microsoft YaHei"/>
+        </w:rPr>
+        <w:t>已实施修复</w:t>
+      </w:r>
+    </w:p>
+    <w:p>
+      <w:pPr>
+        <w:ind w:left="397" w:hanging="255"/>
+      </w:pPr>
+      <w:r>
+        <w:rPr>
+          <w:rFonts w:ascii="Aptos" w:hAnsi="Aptos" w:eastAsia="Microsoft YaHei"/>
+        </w:rPr>
+        <w:t>1. 自定义 Differences 映射处理带后缀、uniXXXX 和 uXXXXX 字形名称。</w:t>
+      </w:r>
+    </w:p>
+    <w:p>
+      <w:pPr>
+        <w:ind w:left="397" w:hanging="255"/>
+      </w:pPr>
+      <w:r>
+        <w:rPr>
+          <w:rFonts w:ascii="Aptos" w:hAnsi="Aptos" w:eastAsia="Microsoft YaHei"/>
+        </w:rPr>
+        <w:t>2. 已处理的字典不再交给 lopdf 重复解析；未映射字形仅写入精简 debug 日志。</w:t>
+      </w:r>
+    </w:p>
+    <w:p>
+      <w:pPr>
+        <w:ind w:left="397" w:hanging="255"/>
+      </w:pPr>
+      <w:r>
+        <w:rPr>
+          <w:rFonts w:ascii="Aptos" w:hAnsi="Aptos" w:eastAsia="Microsoft YaHei"/>
+        </w:rPr>
+        <w:t>3. Adobe Glyph List 覆盖历史字形，连字由规范化流程展开。</w:t>
+      </w:r>
+    </w:p>
+    <w:p>
+      <w:pPr>
+        <w:pStyle w:val="Heading2"/>
+      </w:pPr>
+      <w:r>
+        <w:rPr>
+          <w:rFonts w:ascii="Aptos" w:hAnsi="Aptos" w:eastAsia="Microsoft YaHei"/>
+        </w:rPr>
+        <w:t>修复结果</w:t>
+      </w:r>
+    </w:p>
+    <w:p>
+      <w:pPr>
+        <w:ind w:left="397" w:hanging="255"/>
+      </w:pPr>
+      <w:r>
+        <w:rPr>
+          <w:rFonts w:ascii="Aptos" w:hAnsi="Aptos" w:eastAsia="Microsoft YaHei"/>
+        </w:rPr>
+        <w:t>1. 408 页和 408 个页面标记全部保留。</w:t>
+      </w:r>
+    </w:p>
+    <w:p>
+      <w:pPr>
+        <w:ind w:left="397" w:hanging="255"/>
+      </w:pPr>
+      <w:r>
+        <w:rPr>
+          <w:rFonts w:ascii="Aptos" w:hAnsi="Aptos" w:eastAsia="Microsoft YaHei"/>
+        </w:rPr>
+        <w:t>2. InvalidEncodingDifferenceGlyph 和 U+FFFD 均为 0。</w:t>
+      </w:r>
+    </w:p>
+    <w:p>
+      <w:pPr>
+        <w:ind w:left="397" w:hanging="255"/>
+      </w:pPr>
+      <w:r>
+        <w:rPr>
+          <w:rFonts w:ascii="Aptos" w:hAnsi="Aptos" w:eastAsia="Microsoft YaHei"/>
+        </w:rPr>
+        <w:t>3. 保留 8,741 个 long s；自动检查统计 265,132 个 Latin 字母并通过。</w:t>
+      </w:r>
+    </w:p>
+    <w:p>
+      <w:pPr>
+        <w:pStyle w:val="Heading1"/>
+      </w:pPr>
+      <w:r>
+        <w:t>9. PDF-009：仅检查 U+FFFD 无法发现全部乱码</w:t>
       </w:r>
     </w:p>
     <w:p>
@@ -3728,7 +3952,40 @@
         <w:rPr>
           <w:rFonts w:ascii="Aptos" w:hAnsi="Aptos" w:eastAsia="Microsoft YaHei"/>
         </w:rPr>
-        <w:t>影响模块：字体解析日志、编码回退</w:t>
+        <w:t>发现时间：2026-09-06</w:t>
+      </w:r>
+    </w:p>
+    <w:p>
+      <w:pPr>
+        <w:pStyle w:val="ListBullet"/>
+      </w:pPr>
+      <w:r>
+        <w:rPr>
+          <w:rFonts w:ascii="Aptos" w:hAnsi="Aptos" w:eastAsia="Microsoft YaHei"/>
+        </w:rPr>
+        <w:t>修复时间：2026-09-07（Asia/Shanghai）</w:t>
+      </w:r>
+    </w:p>
+    <w:p>
+      <w:pPr>
+        <w:pStyle w:val="ListBullet"/>
+      </w:pPr>
+      <w:r>
+        <w:rPr>
+          <w:rFonts w:ascii="Aptos" w:hAnsi="Aptos" w:eastAsia="Microsoft YaHei"/>
+        </w:rPr>
+        <w:t>级别：中</w:t>
+      </w:r>
+    </w:p>
+    <w:p>
+      <w:pPr>
+        <w:pStyle w:val="ListBullet"/>
+      </w:pPr>
+      <w:r>
+        <w:rPr>
+          <w:rFonts w:ascii="Aptos" w:hAnsi="Aptos" w:eastAsia="Microsoft YaHei"/>
+        </w:rPr>
+        <w:t>状态：已关闭（自动质量检查已补充并通过目标样本）</w:t>
       </w:r>
     </w:p>
     <w:p>
@@ -3739,15 +3996,16 @@
         <w:rPr>
           <w:rFonts w:ascii="Aptos" w:hAnsi="Aptos" w:eastAsia="Microsoft YaHei"/>
         </w:rPr>
-        <w:t>现象</w:t>
-      </w:r>
-    </w:p>
-    <w:p>
-      <w:r>
-        <w:rPr>
-          <w:rFonts w:ascii="Aptos" w:hAnsi="Aptos" w:eastAsia="Microsoft YaHei"/>
-        </w:rPr>
-        <w:t>第二批 09-historical-essay.pdf 虽然成功转换 408 页，但日志反复输出 InvalidEncodingDifferenceGlyph，并附带体积很大的完整字体字典。主要涉及 long s、连字和 swash 字形。</w:t>
+        <w:t>已确认原因</w:t>
+      </w:r>
+    </w:p>
+    <w:p>
+      <w:pPr/>
+      <w:r>
+        <w:rPr>
+          <w:rFonts w:ascii="Aptos" w:hAnsi="Aptos" w:eastAsia="Microsoft YaHei"/>
+        </w:rPr>
+        <w:t>U+FFFD 只能反映明确解码失败；错误码点仍是合法 Unicode 时，必须结合预期文字脚本和异常字符模式判断。</w:t>
       </w:r>
     </w:p>
     <w:p>
@@ -3758,7 +4016,7 @@
         <w:rPr>
           <w:rFonts w:ascii="Aptos" w:hAnsi="Aptos" w:eastAsia="Microsoft YaHei"/>
         </w:rPr>
-        <w:t>风险</w:t>
+        <w:t>已实施修复</w:t>
       </w:r>
     </w:p>
     <w:p>
@@ -3769,7 +4027,7 @@
         <w:rPr>
           <w:rFonts w:ascii="Aptos" w:hAnsi="Aptos" w:eastAsia="Microsoft YaHei"/>
         </w:rPr>
-        <w:t>1. 大量重复日志掩盖真正错误。</w:t>
+        <w:t>1. 新增 scripts/check_text_quality.py，统计六类 Unicode 文字脚本。</w:t>
       </w:r>
     </w:p>
     <w:p>
@@ -3780,7 +4038,7 @@
         <w:rPr>
           <w:rFonts w:ascii="Aptos" w:hAnsi="Aptos" w:eastAsia="Microsoft YaHei"/>
         </w:rPr>
-        <w:t>2. 特殊字形虽然没有生成 U+FFFD，仍可能被错误替换或丢失。</w:t>
+        <w:t>2. 支持预期脚本、禁用脚本、最少字符数及异常字符阈值。</w:t>
       </w:r>
     </w:p>
     <w:p>
@@ -3791,7 +4049,18 @@
         <w:rPr>
           <w:rFonts w:ascii="Aptos" w:hAnsi="Aptos" w:eastAsia="Microsoft YaHei"/>
         </w:rPr>
-        <w:t>3. 批量测试日志体积和处理成本增加。</w:t>
+        <w:t>3. JSON 输出和 0/1 退出码可直接接入批量回归。</w:t>
+      </w:r>
+    </w:p>
+    <w:p>
+      <w:pPr>
+        <w:ind w:left="397" w:hanging="255"/>
+      </w:pPr>
+      <w:r>
+        <w:rPr>
+          <w:rFonts w:ascii="Aptos" w:hAnsi="Aptos" w:eastAsia="Microsoft YaHei"/>
+        </w:rPr>
+        <w:t>4. 新增 4 项测试，覆盖错误脚本、正常阿拉伯文、中英双语和异常字符。</w:t>
       </w:r>
     </w:p>
     <w:p>
@@ -3802,7 +4071,7 @@
         <w:rPr>
           <w:rFonts w:ascii="Aptos" w:hAnsi="Aptos" w:eastAsia="Microsoft YaHei"/>
         </w:rPr>
-        <w:t>解决方案</w:t>
+        <w:t>修复结果</w:t>
       </w:r>
     </w:p>
     <w:p>
@@ -3813,7 +4082,7 @@
         <w:rPr>
           <w:rFonts w:ascii="Aptos" w:hAnsi="Aptos" w:eastAsia="Microsoft YaHei"/>
         </w:rPr>
-        <w:t>1. 按“字体对象 + 字形名”去重警告。</w:t>
+        <w:t>1. 阿拉伯样本：Arabic 405、Latin 765、Han 0、U+FFFD 0，检查通过。</w:t>
       </w:r>
     </w:p>
     <w:p>
@@ -3824,7 +4093,7 @@
         <w:rPr>
           <w:rFonts w:ascii="Aptos" w:hAnsi="Aptos" w:eastAsia="Microsoft YaHei"/>
         </w:rPr>
-        <w:t>2. 日志只输出字体名、对象号、字形名和回退策略，不打印完整字体字典。</w:t>
+        <w:t>2. 历史英文样本：Latin 265,132，异常字符为 0，检查通过。</w:t>
       </w:r>
     </w:p>
     <w:p>
@@ -3835,7 +4104,7 @@
         <w:rPr>
           <w:rFonts w:ascii="Aptos" w:hAnsi="Aptos" w:eastAsia="Microsoft YaHei"/>
         </w:rPr>
-        <w:t>3. 扩充常见历史字形、连字和 swash 字形映射。</w:t>
+        <w:t>3. 中英双语样本：Han 6,768、Latin 34,484，脚本组合正确接受。</w:t>
       </w:r>
     </w:p>
     <w:p>
@@ -3846,7 +4115,7 @@
         <w:rPr>
           <w:rFonts w:ascii="Aptos" w:hAnsi="Aptos" w:eastAsia="Microsoft YaHei"/>
         </w:rPr>
-        <w:t>4. 在调试级别保留完整对象信息，默认警告级别输出汇总。</w:t>
+        <w:t>4. Python 单元测试 4 项通过，0 项失败。</w:t>
       </w:r>
     </w:p>
     <w:p>
@@ -3857,7 +4126,28 @@
         <w:rPr>
           <w:rFonts w:ascii="Aptos" w:hAnsi="Aptos" w:eastAsia="Microsoft YaHei"/>
         </w:rPr>
-        <w:t>验收标准</w:t>
+        <w:t>使用方式</w:t>
+      </w:r>
+    </w:p>
+    <w:p>
+      <w:pPr/>
+      <w:r>
+        <w:rPr>
+          <w:rFonts w:ascii="Consolas" w:hAnsi="Consolas" w:eastAsia="Microsoft YaHei"/>
+          <w:sz w:val="18"/>
+        </w:rPr>
+        <w:t>python scripts/check_text_quality.py output.md --expect-script arabic --forbid-script han --min-script-characters 50 --max-replacement-characters 0</w:t>
+      </w:r>
+    </w:p>
+    <w:p>
+      <w:pPr>
+        <w:pStyle w:val="Heading1"/>
+      </w:pPr>
+      <w:r>
+        <w:rPr>
+          <w:rFonts w:ascii="Aptos" w:hAnsi="Aptos" w:eastAsia="Microsoft YaHei"/>
+        </w:rPr>
+        <w:t>建议修复顺序</w:t>
       </w:r>
     </w:p>
     <w:p>
@@ -3868,7 +4158,7 @@
         <w:rPr>
           <w:rFonts w:ascii="Aptos" w:hAnsi="Aptos" w:eastAsia="Microsoft YaHei"/>
         </w:rPr>
-        <w:t>1. 相同字体和字形最多产生一次警告或一条汇总。</w:t>
+        <w:t>1. PDF-001：表格页面标记缺失。</w:t>
       </w:r>
     </w:p>
     <w:p>
@@ -3879,7 +4169,7 @@
         <w:rPr>
           <w:rFonts w:ascii="Aptos" w:hAnsi="Aptos" w:eastAsia="Microsoft YaHei"/>
         </w:rPr>
-        <w:t>2. 抽样核对历史字形，确认文字没有丢失或错误替换。</w:t>
+        <w:t>2. PDF-006：阿拉伯文解码乱码。</w:t>
       </w:r>
     </w:p>
     <w:p>
@@ -3890,92 +4180,7 @@
         <w:rPr>
           <w:rFonts w:ascii="Aptos" w:hAnsi="Aptos" w:eastAsia="Microsoft YaHei"/>
         </w:rPr>
-        <w:t>3. JSON 标准输出保持纯净，诊断信息只写入标准错误流。</w:t>
-      </w:r>
-    </w:p>
-    <w:p>
-      <w:pPr>
-        <w:pStyle w:val="Heading1"/>
-      </w:pPr>
-      <w:r>
-        <w:rPr>
-          <w:rFonts w:ascii="Aptos" w:hAnsi="Aptos" w:eastAsia="Microsoft YaHei"/>
-        </w:rPr>
-        <w:t>9. PDF-009：仅检查 U+FFFD 无法发现全部乱码</w:t>
-      </w:r>
-    </w:p>
-    <w:p>
-      <w:pPr>
-        <w:pStyle w:val="ListBullet"/>
-      </w:pPr>
-      <w:r>
-        <w:rPr>
-          <w:rFonts w:ascii="Aptos" w:hAnsi="Aptos" w:eastAsia="Microsoft YaHei"/>
-        </w:rPr>
-        <w:t>发现时间：2026-09-06</w:t>
-      </w:r>
-    </w:p>
-    <w:p>
-      <w:pPr>
-        <w:pStyle w:val="ListBullet"/>
-      </w:pPr>
-      <w:r>
-        <w:rPr>
-          <w:rFonts w:ascii="Aptos" w:hAnsi="Aptos" w:eastAsia="Microsoft YaHei"/>
-        </w:rPr>
-        <w:t>级别：中</w:t>
-      </w:r>
-    </w:p>
-    <w:p>
-      <w:pPr>
-        <w:pStyle w:val="ListBullet"/>
-      </w:pPr>
-      <w:r>
-        <w:rPr>
-          <w:rFonts w:ascii="Aptos" w:hAnsi="Aptos" w:eastAsia="Microsoft YaHei"/>
-        </w:rPr>
-        <w:t>状态：待补充测试</w:t>
-      </w:r>
-    </w:p>
-    <w:p>
-      <w:pPr>
-        <w:pStyle w:val="ListBullet"/>
-      </w:pPr>
-      <w:r>
-        <w:rPr>
-          <w:rFonts w:ascii="Aptos" w:hAnsi="Aptos" w:eastAsia="Microsoft YaHei"/>
-        </w:rPr>
-        <w:t>影响模块：本地回归测试和输出质量检测</w:t>
-      </w:r>
-    </w:p>
-    <w:p>
-      <w:pPr>
-        <w:pStyle w:val="Heading2"/>
-      </w:pPr>
-      <w:r>
-        <w:rPr>
-          <w:rFonts w:ascii="Aptos" w:hAnsi="Aptos" w:eastAsia="Microsoft YaHei"/>
-        </w:rPr>
-        <w:t>现象</w:t>
-      </w:r>
-    </w:p>
-    <w:p>
-      <w:r>
-        <w:rPr>
-          <w:rFonts w:ascii="Aptos" w:hAnsi="Aptos" w:eastAsia="Microsoft YaHei"/>
-        </w:rPr>
-        <w:t>两批输出的 U+FFFD 计数均为 0，但阿拉伯文样本仍产生大量错误的 CJK 字符。这说明“没有替换字符”不等于“文本解码正确”。</w:t>
-      </w:r>
-    </w:p>
-    <w:p>
-      <w:pPr>
-        <w:pStyle w:val="Heading2"/>
-      </w:pPr>
-      <w:r>
-        <w:rPr>
-          <w:rFonts w:ascii="Aptos" w:hAnsi="Aptos" w:eastAsia="Microsoft YaHei"/>
-        </w:rPr>
-        <w:t>解决方案</w:t>
+        <w:t>3. PDF-007：非零起始偏移 PDF 被拒绝。</w:t>
       </w:r>
     </w:p>
     <w:p>
@@ -3986,7 +4191,7 @@
         <w:rPr>
           <w:rFonts w:ascii="Aptos" w:hAnsi="Aptos" w:eastAsia="Microsoft YaHei"/>
         </w:rPr>
-        <w:t>1. 增加按 Unicode Script 分类的字符统计。</w:t>
+        <w:t>4. PDF-003：多栏正文误判表格。</w:t>
       </w:r>
     </w:p>
     <w:p>
@@ -3997,7 +4202,7 @@
         <w:rPr>
           <w:rFonts w:ascii="Aptos" w:hAnsi="Aptos" w:eastAsia="Microsoft YaHei"/>
         </w:rPr>
-        <w:t>2. 将 PDF 字体、ToUnicode 或字形名称推断出的主要文字脚本与输出脚本进行比较。</w:t>
+        <w:t>5. PDF-005：OCR 误报。</w:t>
       </w:r>
     </w:p>
     <w:p>
@@ -4008,7 +4213,7 @@
         <w:rPr>
           <w:rFonts w:ascii="Aptos" w:hAnsi="Aptos" w:eastAsia="Microsoft YaHei"/>
         </w:rPr>
-        <w:t>3. 增加常见乱码模式检查，例如“锟”、异常控制字符和与文档语言无关的大量字符。</w:t>
+        <w:t>6. PDF-002：无文本页的连续编号规则。</w:t>
       </w:r>
     </w:p>
     <w:p>
@@ -4016,10 +4221,7 @@
         <w:ind w:left="397" w:hanging="255"/>
       </w:pPr>
       <w:r>
-        <w:rPr>
-          <w:rFonts w:ascii="Aptos" w:hAnsi="Aptos" w:eastAsia="Microsoft YaHei"/>
-        </w:rPr>
-        <w:t>4. 为已知语言样本保存最小语义断言，例如输出至少包含一定数量的阿拉伯字母。</w:t>
+        <w:t>7. PDF-004：检测与转换结果统一（已关闭）。</w:t>
       </w:r>
     </w:p>
     <w:p>
@@ -4027,21 +4229,7 @@
         <w:ind w:left="397" w:hanging="255"/>
       </w:pPr>
       <w:r>
-        <w:rPr>
-          <w:rFonts w:ascii="Aptos" w:hAnsi="Aptos" w:eastAsia="Microsoft YaHei"/>
-        </w:rPr>
-        <w:t>5. 保留人工抽样检查，避免自动指标把合法的多语言内容误报为乱码。</w:t>
-      </w:r>
-    </w:p>
-    <w:p>
-      <w:pPr>
-        <w:pStyle w:val="Heading2"/>
-      </w:pPr>
-      <w:r>
-        <w:rPr>
-          <w:rFonts w:ascii="Aptos" w:hAnsi="Aptos" w:eastAsia="Microsoft YaHei"/>
-        </w:rPr>
-        <w:t>验收标准</w:t>
+        <w:t>8. PDF-008：字体警告降噪（已关闭）。</w:t>
       </w:r>
     </w:p>
     <w:p>
@@ -4049,142 +4237,7 @@
         <w:ind w:left="397" w:hanging="255"/>
       </w:pPr>
       <w:r>
-        <w:rPr>
-          <w:rFonts w:ascii="Aptos" w:hAnsi="Aptos" w:eastAsia="Microsoft YaHei"/>
-        </w:rPr>
-        <w:t>1. 当前阿拉伯文样本能够被自动质量检查判定为失败。</w:t>
-      </w:r>
-    </w:p>
-    <w:p>
-      <w:pPr>
-        <w:ind w:left="397" w:hanging="255"/>
-      </w:pPr>
-      <w:r>
-        <w:rPr>
-          <w:rFonts w:ascii="Aptos" w:hAnsi="Aptos" w:eastAsia="Microsoft YaHei"/>
-        </w:rPr>
-        <w:t>2. 中英双语表单不会因为同时出现中文和英文而误报。</w:t>
-      </w:r>
-    </w:p>
-    <w:p>
-      <w:pPr>
-        <w:ind w:left="397" w:hanging="255"/>
-      </w:pPr>
-      <w:r>
-        <w:rPr>
-          <w:rFonts w:ascii="Aptos" w:hAnsi="Aptos" w:eastAsia="Microsoft YaHei"/>
-        </w:rPr>
-        <w:t>3. 普通英文、冰岛语和 RTL 样本分别具有独立的合理性规则。</w:t>
-      </w:r>
-    </w:p>
-    <w:p>
-      <w:pPr>
-        <w:pStyle w:val="Heading1"/>
-      </w:pPr>
-      <w:r>
-        <w:rPr>
-          <w:rFonts w:ascii="Aptos" w:hAnsi="Aptos" w:eastAsia="Microsoft YaHei"/>
-        </w:rPr>
-        <w:t>建议修复顺序</w:t>
-      </w:r>
-    </w:p>
-    <w:p>
-      <w:pPr>
-        <w:ind w:left="397" w:hanging="255"/>
-      </w:pPr>
-      <w:r>
-        <w:rPr>
-          <w:rFonts w:ascii="Aptos" w:hAnsi="Aptos" w:eastAsia="Microsoft YaHei"/>
-        </w:rPr>
-        <w:t>1. PDF-001：表格页面标记缺失。</w:t>
-      </w:r>
-    </w:p>
-    <w:p>
-      <w:pPr>
-        <w:ind w:left="397" w:hanging="255"/>
-      </w:pPr>
-      <w:r>
-        <w:rPr>
-          <w:rFonts w:ascii="Aptos" w:hAnsi="Aptos" w:eastAsia="Microsoft YaHei"/>
-        </w:rPr>
-        <w:t>2. PDF-006：阿拉伯文解码乱码。</w:t>
-      </w:r>
-    </w:p>
-    <w:p>
-      <w:pPr>
-        <w:ind w:left="397" w:hanging="255"/>
-      </w:pPr>
-      <w:r>
-        <w:rPr>
-          <w:rFonts w:ascii="Aptos" w:hAnsi="Aptos" w:eastAsia="Microsoft YaHei"/>
-        </w:rPr>
-        <w:t>3. PDF-007：非零起始偏移 PDF 被拒绝。</w:t>
-      </w:r>
-    </w:p>
-    <w:p>
-      <w:pPr>
-        <w:ind w:left="397" w:hanging="255"/>
-      </w:pPr>
-      <w:r>
-        <w:rPr>
-          <w:rFonts w:ascii="Aptos" w:hAnsi="Aptos" w:eastAsia="Microsoft YaHei"/>
-        </w:rPr>
-        <w:t>4. PDF-003：多栏正文误判表格。</w:t>
-      </w:r>
-    </w:p>
-    <w:p>
-      <w:pPr>
-        <w:ind w:left="397" w:hanging="255"/>
-      </w:pPr>
-      <w:r>
-        <w:rPr>
-          <w:rFonts w:ascii="Aptos" w:hAnsi="Aptos" w:eastAsia="Microsoft YaHei"/>
-        </w:rPr>
-        <w:t>5. PDF-005：OCR 误报。</w:t>
-      </w:r>
-    </w:p>
-    <w:p>
-      <w:pPr>
-        <w:ind w:left="397" w:hanging="255"/>
-      </w:pPr>
-      <w:r>
-        <w:rPr>
-          <w:rFonts w:ascii="Aptos" w:hAnsi="Aptos" w:eastAsia="Microsoft YaHei"/>
-        </w:rPr>
-        <w:t>6. PDF-002：无文本页的连续编号规则。</w:t>
-      </w:r>
-    </w:p>
-    <w:p>
-      <w:pPr>
-        <w:ind w:left="397" w:hanging="255"/>
-      </w:pPr>
-      <w:r>
-        <w:rPr>
-          <w:rFonts w:ascii="Aptos" w:hAnsi="Aptos" w:eastAsia="Microsoft YaHei"/>
-        </w:rPr>
-        <w:t>7. PDF-004：检测与转换结果统一。</w:t>
-      </w:r>
-    </w:p>
-    <w:p>
-      <w:pPr>
-        <w:ind w:left="397" w:hanging="255"/>
-      </w:pPr>
-      <w:r>
-        <w:rPr>
-          <w:rFonts w:ascii="Aptos" w:hAnsi="Aptos" w:eastAsia="Microsoft YaHei"/>
-        </w:rPr>
-        <w:t>8. PDF-008：字体警告降噪。</w:t>
-      </w:r>
-    </w:p>
-    <w:p>
-      <w:pPr>
-        <w:ind w:left="397" w:hanging="255"/>
-      </w:pPr>
-      <w:r>
-        <w:rPr>
-          <w:rFonts w:ascii="Aptos" w:hAnsi="Aptos" w:eastAsia="Microsoft YaHei"/>
-        </w:rPr>
-        <w:t>9. PDF-009：补充自动质量检查。</w:t>
+        <w:t>9. PDF-009：补充自动质量检查（已关闭）。</w:t>
       </w:r>
     </w:p>
     <w:p>

</xml_diff>